<commit_message>
update:read me and document
</commit_message>
<xml_diff>
--- a/使用文档.docx
+++ b/使用文档.docx
@@ -5,6 +5,7 @@
     <w:p>
       <w:pPr>
         <w:pStyle w:val="ae"/>
+        <w:ind w:firstLine="530"/>
         <w:jc w:val="center"/>
       </w:pPr>
       <w:bookmarkStart w:id="0" w:name="_Toc287621253"/>
@@ -56,8 +57,14 @@
           <w:pPr>
             <w:pStyle w:val="TOC1"/>
             <w:tabs>
-              <w:tab w:val="right" w:leader="dot" w:pos="8306"/>
+              <w:tab w:val="right" w:leader="dot" w:pos="8296"/>
             </w:tabs>
+            <w:rPr>
+              <w:noProof/>
+              <w:kern w:val="2"/>
+              <w:szCs w:val="24"/>
+              <w14:ligatures w14:val="standardContextual"/>
+            </w:rPr>
           </w:pPr>
           <w:r>
             <w:fldChar w:fldCharType="begin"/>
@@ -68,41 +75,95 @@
           <w:r>
             <w:fldChar w:fldCharType="separate"/>
           </w:r>
-          <w:hyperlink w:anchor="_Toc27204" w:history="1">
-            <w:r>
-              <w:rPr>
-                <w:rFonts w:hint="eastAsia"/>
+          <w:hyperlink w:anchor="_Toc229756635" w:history="1">
+            <w:r>
+              <w:rPr>
+                <w:rStyle w:val="af4"/>
+                <w:noProof/>
               </w:rPr>
               <w:t>一</w:t>
             </w:r>
             <w:r>
               <w:rPr>
-                <w:rFonts w:hint="eastAsia"/>
+                <w:rStyle w:val="af4"/>
+                <w:noProof/>
               </w:rPr>
               <w:t xml:space="preserve"> </w:t>
             </w:r>
             <w:r>
               <w:rPr>
-                <w:rFonts w:hint="eastAsia"/>
+                <w:rStyle w:val="af4"/>
+                <w:noProof/>
               </w:rPr>
               <w:t>概述</w:t>
             </w:r>
             <w:r>
+              <w:rPr>
+                <w:rFonts w:hint="eastAsia"/>
+                <w:noProof/>
+                <w:webHidden/>
+              </w:rPr>
               <w:tab/>
             </w:r>
             <w:r>
+              <w:rPr>
+                <w:rFonts w:hint="eastAsia"/>
+                <w:noProof/>
+                <w:webHidden/>
+              </w:rPr>
               <w:fldChar w:fldCharType="begin"/>
             </w:r>
             <w:r>
-              <w:instrText xml:space="preserve"> PAGEREF _Toc27204 \h </w:instrText>
-            </w:r>
-            <w:r>
+              <w:rPr>
+                <w:rFonts w:hint="eastAsia"/>
+                <w:noProof/>
+                <w:webHidden/>
+              </w:rPr>
+              <w:instrText xml:space="preserve"> </w:instrText>
+            </w:r>
+            <w:r>
+              <w:rPr>
+                <w:noProof/>
+                <w:webHidden/>
+              </w:rPr>
+              <w:instrText>PAGEREF _Toc229756635 \h</w:instrText>
+            </w:r>
+            <w:r>
+              <w:rPr>
+                <w:rFonts w:hint="eastAsia"/>
+                <w:noProof/>
+                <w:webHidden/>
+              </w:rPr>
+              <w:instrText xml:space="preserve"> </w:instrText>
+            </w:r>
+            <w:r>
+              <w:rPr>
+                <w:rFonts w:hint="eastAsia"/>
+                <w:noProof/>
+                <w:webHidden/>
+              </w:rPr>
+            </w:r>
+            <w:r>
+              <w:rPr>
+                <w:rFonts w:hint="eastAsia"/>
+                <w:noProof/>
+                <w:webHidden/>
+              </w:rPr>
               <w:fldChar w:fldCharType="separate"/>
             </w:r>
             <w:r>
+              <w:rPr>
+                <w:noProof/>
+                <w:webHidden/>
+              </w:rPr>
               <w:t>3</w:t>
             </w:r>
             <w:r>
+              <w:rPr>
+                <w:rFonts w:hint="eastAsia"/>
+                <w:noProof/>
+                <w:webHidden/>
+              </w:rPr>
               <w:fldChar w:fldCharType="end"/>
             </w:r>
           </w:hyperlink>
@@ -111,36 +172,98 @@
           <w:pPr>
             <w:pStyle w:val="TOC2"/>
             <w:tabs>
-              <w:tab w:val="right" w:leader="dot" w:pos="8306"/>
+              <w:tab w:val="right" w:leader="dot" w:pos="8296"/>
             </w:tabs>
             <w:ind w:left="440"/>
+            <w:rPr>
+              <w:noProof/>
+              <w:kern w:val="2"/>
+              <w:szCs w:val="24"/>
+              <w14:ligatures w14:val="standardContextual"/>
+            </w:rPr>
           </w:pPr>
-          <w:hyperlink w:anchor="_Toc3075" w:history="1">
-            <w:r>
+          <w:hyperlink w:anchor="_Toc229756636" w:history="1">
+            <w:r>
+              <w:rPr>
+                <w:rStyle w:val="af4"/>
+                <w:noProof/>
+              </w:rPr>
               <w:t xml:space="preserve">1.1 </w:t>
             </w:r>
             <w:r>
               <w:rPr>
-                <w:rFonts w:hint="eastAsia"/>
+                <w:rStyle w:val="af4"/>
+                <w:noProof/>
               </w:rPr>
               <w:t>准备</w:t>
             </w:r>
             <w:r>
+              <w:rPr>
+                <w:rFonts w:hint="eastAsia"/>
+                <w:noProof/>
+                <w:webHidden/>
+              </w:rPr>
               <w:tab/>
             </w:r>
             <w:r>
+              <w:rPr>
+                <w:rFonts w:hint="eastAsia"/>
+                <w:noProof/>
+                <w:webHidden/>
+              </w:rPr>
               <w:fldChar w:fldCharType="begin"/>
             </w:r>
             <w:r>
-              <w:instrText xml:space="preserve"> PAGEREF _Toc3075 \h </w:instrText>
-            </w:r>
-            <w:r>
+              <w:rPr>
+                <w:rFonts w:hint="eastAsia"/>
+                <w:noProof/>
+                <w:webHidden/>
+              </w:rPr>
+              <w:instrText xml:space="preserve"> </w:instrText>
+            </w:r>
+            <w:r>
+              <w:rPr>
+                <w:noProof/>
+                <w:webHidden/>
+              </w:rPr>
+              <w:instrText>PAGEREF _Toc229756636 \h</w:instrText>
+            </w:r>
+            <w:r>
+              <w:rPr>
+                <w:rFonts w:hint="eastAsia"/>
+                <w:noProof/>
+                <w:webHidden/>
+              </w:rPr>
+              <w:instrText xml:space="preserve"> </w:instrText>
+            </w:r>
+            <w:r>
+              <w:rPr>
+                <w:rFonts w:hint="eastAsia"/>
+                <w:noProof/>
+                <w:webHidden/>
+              </w:rPr>
+            </w:r>
+            <w:r>
+              <w:rPr>
+                <w:rFonts w:hint="eastAsia"/>
+                <w:noProof/>
+                <w:webHidden/>
+              </w:rPr>
               <w:fldChar w:fldCharType="separate"/>
             </w:r>
             <w:r>
+              <w:rPr>
+                <w:noProof/>
+                <w:webHidden/>
+              </w:rPr>
               <w:t>3</w:t>
             </w:r>
             <w:r>
+              <w:rPr>
+                <w:rFonts w:hint="eastAsia"/>
+                <w:noProof/>
+                <w:webHidden/>
+              </w:rPr>
               <w:fldChar w:fldCharType="end"/>
             </w:r>
           </w:hyperlink>
@@ -149,39 +272,98 @@
           <w:pPr>
             <w:pStyle w:val="TOC3"/>
             <w:tabs>
-              <w:tab w:val="right" w:leader="dot" w:pos="8306"/>
+              <w:tab w:val="right" w:leader="dot" w:pos="8296"/>
             </w:tabs>
             <w:ind w:left="880"/>
+            <w:rPr>
+              <w:noProof/>
+              <w:kern w:val="2"/>
+              <w:szCs w:val="24"/>
+              <w14:ligatures w14:val="standardContextual"/>
+            </w:rPr>
           </w:pPr>
-          <w:hyperlink w:anchor="_Toc26402" w:history="1">
-            <w:r>
-              <w:rPr>
-                <w:rFonts w:hint="eastAsia"/>
+          <w:hyperlink w:anchor="_Toc229756637" w:history="1">
+            <w:r>
+              <w:rPr>
+                <w:rStyle w:val="af4"/>
+                <w:noProof/>
               </w:rPr>
               <w:t xml:space="preserve">1.1.1 </w:t>
             </w:r>
             <w:r>
               <w:rPr>
-                <w:rFonts w:hint="eastAsia"/>
+                <w:rStyle w:val="af4"/>
+                <w:noProof/>
               </w:rPr>
               <w:t>主界面</w:t>
             </w:r>
             <w:r>
+              <w:rPr>
+                <w:rFonts w:hint="eastAsia"/>
+                <w:noProof/>
+                <w:webHidden/>
+              </w:rPr>
               <w:tab/>
             </w:r>
             <w:r>
+              <w:rPr>
+                <w:rFonts w:hint="eastAsia"/>
+                <w:noProof/>
+                <w:webHidden/>
+              </w:rPr>
               <w:fldChar w:fldCharType="begin"/>
             </w:r>
             <w:r>
-              <w:instrText xml:space="preserve"> PAGEREF _Toc26402 \h </w:instrText>
-            </w:r>
-            <w:r>
+              <w:rPr>
+                <w:rFonts w:hint="eastAsia"/>
+                <w:noProof/>
+                <w:webHidden/>
+              </w:rPr>
+              <w:instrText xml:space="preserve"> </w:instrText>
+            </w:r>
+            <w:r>
+              <w:rPr>
+                <w:noProof/>
+                <w:webHidden/>
+              </w:rPr>
+              <w:instrText>PAGEREF _Toc229756637 \h</w:instrText>
+            </w:r>
+            <w:r>
+              <w:rPr>
+                <w:rFonts w:hint="eastAsia"/>
+                <w:noProof/>
+                <w:webHidden/>
+              </w:rPr>
+              <w:instrText xml:space="preserve"> </w:instrText>
+            </w:r>
+            <w:r>
+              <w:rPr>
+                <w:rFonts w:hint="eastAsia"/>
+                <w:noProof/>
+                <w:webHidden/>
+              </w:rPr>
+            </w:r>
+            <w:r>
+              <w:rPr>
+                <w:rFonts w:hint="eastAsia"/>
+                <w:noProof/>
+                <w:webHidden/>
+              </w:rPr>
               <w:fldChar w:fldCharType="separate"/>
             </w:r>
             <w:r>
+              <w:rPr>
+                <w:noProof/>
+                <w:webHidden/>
+              </w:rPr>
               <w:t>3</w:t>
             </w:r>
             <w:r>
+              <w:rPr>
+                <w:rFonts w:hint="eastAsia"/>
+                <w:noProof/>
+                <w:webHidden/>
+              </w:rPr>
               <w:fldChar w:fldCharType="end"/>
             </w:r>
           </w:hyperlink>
@@ -190,39 +372,198 @@
           <w:pPr>
             <w:pStyle w:val="TOC3"/>
             <w:tabs>
-              <w:tab w:val="right" w:leader="dot" w:pos="8306"/>
+              <w:tab w:val="right" w:leader="dot" w:pos="8296"/>
             </w:tabs>
             <w:ind w:left="880"/>
+            <w:rPr>
+              <w:noProof/>
+              <w:kern w:val="2"/>
+              <w:szCs w:val="24"/>
+              <w14:ligatures w14:val="standardContextual"/>
+            </w:rPr>
           </w:pPr>
-          <w:hyperlink w:anchor="_Toc3231" w:history="1">
-            <w:r>
-              <w:rPr>
-                <w:rFonts w:hint="eastAsia"/>
+          <w:hyperlink w:anchor="_Toc229756638" w:history="1">
+            <w:r>
+              <w:rPr>
+                <w:rStyle w:val="af4"/>
+                <w:noProof/>
               </w:rPr>
               <w:t xml:space="preserve">1.1.2 </w:t>
             </w:r>
             <w:r>
               <w:rPr>
-                <w:rFonts w:hint="eastAsia"/>
-              </w:rPr>
-              <w:t>配置界面</w:t>
-            </w:r>
-            <w:r>
+                <w:rStyle w:val="af4"/>
+                <w:noProof/>
+              </w:rPr>
+              <w:t>编码配置</w:t>
+            </w:r>
+            <w:r>
+              <w:rPr>
+                <w:rFonts w:hint="eastAsia"/>
+                <w:noProof/>
+                <w:webHidden/>
+              </w:rPr>
               <w:tab/>
             </w:r>
             <w:r>
+              <w:rPr>
+                <w:rFonts w:hint="eastAsia"/>
+                <w:noProof/>
+                <w:webHidden/>
+              </w:rPr>
               <w:fldChar w:fldCharType="begin"/>
             </w:r>
             <w:r>
-              <w:instrText xml:space="preserve"> PAGEREF _Toc3231 \h </w:instrText>
-            </w:r>
-            <w:r>
+              <w:rPr>
+                <w:rFonts w:hint="eastAsia"/>
+                <w:noProof/>
+                <w:webHidden/>
+              </w:rPr>
+              <w:instrText xml:space="preserve"> </w:instrText>
+            </w:r>
+            <w:r>
+              <w:rPr>
+                <w:noProof/>
+                <w:webHidden/>
+              </w:rPr>
+              <w:instrText>PAGEREF _Toc229756638 \h</w:instrText>
+            </w:r>
+            <w:r>
+              <w:rPr>
+                <w:rFonts w:hint="eastAsia"/>
+                <w:noProof/>
+                <w:webHidden/>
+              </w:rPr>
+              <w:instrText xml:space="preserve"> </w:instrText>
+            </w:r>
+            <w:r>
+              <w:rPr>
+                <w:rFonts w:hint="eastAsia"/>
+                <w:noProof/>
+                <w:webHidden/>
+              </w:rPr>
+            </w:r>
+            <w:r>
+              <w:rPr>
+                <w:rFonts w:hint="eastAsia"/>
+                <w:noProof/>
+                <w:webHidden/>
+              </w:rPr>
               <w:fldChar w:fldCharType="separate"/>
             </w:r>
             <w:r>
+              <w:rPr>
+                <w:noProof/>
+                <w:webHidden/>
+              </w:rPr>
               <w:t>4</w:t>
             </w:r>
             <w:r>
+              <w:rPr>
+                <w:rFonts w:hint="eastAsia"/>
+                <w:noProof/>
+                <w:webHidden/>
+              </w:rPr>
+              <w:fldChar w:fldCharType="end"/>
+            </w:r>
+          </w:hyperlink>
+        </w:p>
+        <w:p>
+          <w:pPr>
+            <w:pStyle w:val="TOC3"/>
+            <w:tabs>
+              <w:tab w:val="right" w:leader="dot" w:pos="8296"/>
+            </w:tabs>
+            <w:ind w:left="880"/>
+            <w:rPr>
+              <w:noProof/>
+              <w:kern w:val="2"/>
+              <w:szCs w:val="24"/>
+              <w14:ligatures w14:val="standardContextual"/>
+            </w:rPr>
+          </w:pPr>
+          <w:hyperlink w:anchor="_Toc229756639" w:history="1">
+            <w:r>
+              <w:rPr>
+                <w:rStyle w:val="af4"/>
+                <w:noProof/>
+              </w:rPr>
+              <w:t xml:space="preserve">1.1.3 </w:t>
+            </w:r>
+            <w:r>
+              <w:rPr>
+                <w:rStyle w:val="af4"/>
+                <w:noProof/>
+              </w:rPr>
+              <w:t>高级配置</w:t>
+            </w:r>
+            <w:r>
+              <w:rPr>
+                <w:rFonts w:hint="eastAsia"/>
+                <w:noProof/>
+                <w:webHidden/>
+              </w:rPr>
+              <w:tab/>
+            </w:r>
+            <w:r>
+              <w:rPr>
+                <w:rFonts w:hint="eastAsia"/>
+                <w:noProof/>
+                <w:webHidden/>
+              </w:rPr>
+              <w:fldChar w:fldCharType="begin"/>
+            </w:r>
+            <w:r>
+              <w:rPr>
+                <w:rFonts w:hint="eastAsia"/>
+                <w:noProof/>
+                <w:webHidden/>
+              </w:rPr>
+              <w:instrText xml:space="preserve"> </w:instrText>
+            </w:r>
+            <w:r>
+              <w:rPr>
+                <w:noProof/>
+                <w:webHidden/>
+              </w:rPr>
+              <w:instrText>PAGEREF _Toc229756639 \h</w:instrText>
+            </w:r>
+            <w:r>
+              <w:rPr>
+                <w:rFonts w:hint="eastAsia"/>
+                <w:noProof/>
+                <w:webHidden/>
+              </w:rPr>
+              <w:instrText xml:space="preserve"> </w:instrText>
+            </w:r>
+            <w:r>
+              <w:rPr>
+                <w:rFonts w:hint="eastAsia"/>
+                <w:noProof/>
+                <w:webHidden/>
+              </w:rPr>
+            </w:r>
+            <w:r>
+              <w:rPr>
+                <w:rFonts w:hint="eastAsia"/>
+                <w:noProof/>
+                <w:webHidden/>
+              </w:rPr>
+              <w:fldChar w:fldCharType="separate"/>
+            </w:r>
+            <w:r>
+              <w:rPr>
+                <w:noProof/>
+                <w:webHidden/>
+              </w:rPr>
+              <w:t>9</w:t>
+            </w:r>
+            <w:r>
+              <w:rPr>
+                <w:rFonts w:hint="eastAsia"/>
+                <w:noProof/>
+                <w:webHidden/>
+              </w:rPr>
               <w:fldChar w:fldCharType="end"/>
             </w:r>
           </w:hyperlink>
@@ -231,39 +572,98 @@
           <w:pPr>
             <w:pStyle w:val="TOC2"/>
             <w:tabs>
-              <w:tab w:val="right" w:leader="dot" w:pos="8306"/>
+              <w:tab w:val="right" w:leader="dot" w:pos="8296"/>
             </w:tabs>
             <w:ind w:left="440"/>
+            <w:rPr>
+              <w:noProof/>
+              <w:kern w:val="2"/>
+              <w:szCs w:val="24"/>
+              <w14:ligatures w14:val="standardContextual"/>
+            </w:rPr>
           </w:pPr>
-          <w:hyperlink w:anchor="_Toc20431" w:history="1">
-            <w:r>
-              <w:rPr>
-                <w:rFonts w:hint="eastAsia"/>
+          <w:hyperlink w:anchor="_Toc229756640" w:history="1">
+            <w:r>
+              <w:rPr>
+                <w:rStyle w:val="af4"/>
+                <w:noProof/>
               </w:rPr>
               <w:t xml:space="preserve">1.2 </w:t>
             </w:r>
             <w:r>
               <w:rPr>
-                <w:rFonts w:hint="eastAsia"/>
+                <w:rStyle w:val="af4"/>
+                <w:noProof/>
               </w:rPr>
               <w:t>开始转码</w:t>
             </w:r>
             <w:r>
+              <w:rPr>
+                <w:rFonts w:hint="eastAsia"/>
+                <w:noProof/>
+                <w:webHidden/>
+              </w:rPr>
               <w:tab/>
             </w:r>
             <w:r>
+              <w:rPr>
+                <w:rFonts w:hint="eastAsia"/>
+                <w:noProof/>
+                <w:webHidden/>
+              </w:rPr>
               <w:fldChar w:fldCharType="begin"/>
             </w:r>
             <w:r>
-              <w:instrText xml:space="preserve"> PAGEREF _Toc20431 \h </w:instrText>
-            </w:r>
-            <w:r>
+              <w:rPr>
+                <w:rFonts w:hint="eastAsia"/>
+                <w:noProof/>
+                <w:webHidden/>
+              </w:rPr>
+              <w:instrText xml:space="preserve"> </w:instrText>
+            </w:r>
+            <w:r>
+              <w:rPr>
+                <w:noProof/>
+                <w:webHidden/>
+              </w:rPr>
+              <w:instrText>PAGEREF _Toc229756640 \h</w:instrText>
+            </w:r>
+            <w:r>
+              <w:rPr>
+                <w:rFonts w:hint="eastAsia"/>
+                <w:noProof/>
+                <w:webHidden/>
+              </w:rPr>
+              <w:instrText xml:space="preserve"> </w:instrText>
+            </w:r>
+            <w:r>
+              <w:rPr>
+                <w:rFonts w:hint="eastAsia"/>
+                <w:noProof/>
+                <w:webHidden/>
+              </w:rPr>
+            </w:r>
+            <w:r>
+              <w:rPr>
+                <w:rFonts w:hint="eastAsia"/>
+                <w:noProof/>
+                <w:webHidden/>
+              </w:rPr>
               <w:fldChar w:fldCharType="separate"/>
             </w:r>
             <w:r>
-              <w:t>5</w:t>
-            </w:r>
-            <w:r>
+              <w:rPr>
+                <w:noProof/>
+                <w:webHidden/>
+              </w:rPr>
+              <w:t>10</w:t>
+            </w:r>
+            <w:r>
+              <w:rPr>
+                <w:rFonts w:hint="eastAsia"/>
+                <w:noProof/>
+                <w:webHidden/>
+              </w:rPr>
               <w:fldChar w:fldCharType="end"/>
             </w:r>
           </w:hyperlink>
@@ -272,39 +672,98 @@
           <w:pPr>
             <w:pStyle w:val="TOC2"/>
             <w:tabs>
-              <w:tab w:val="right" w:leader="dot" w:pos="8306"/>
+              <w:tab w:val="right" w:leader="dot" w:pos="8296"/>
             </w:tabs>
             <w:ind w:left="440"/>
+            <w:rPr>
+              <w:noProof/>
+              <w:kern w:val="2"/>
+              <w:szCs w:val="24"/>
+              <w14:ligatures w14:val="standardContextual"/>
+            </w:rPr>
           </w:pPr>
-          <w:hyperlink w:anchor="_Toc8890" w:history="1">
-            <w:r>
-              <w:rPr>
-                <w:rFonts w:hint="eastAsia"/>
+          <w:hyperlink w:anchor="_Toc229756641" w:history="1">
+            <w:r>
+              <w:rPr>
+                <w:rStyle w:val="af4"/>
+                <w:noProof/>
               </w:rPr>
               <w:t xml:space="preserve">1.3 </w:t>
             </w:r>
             <w:r>
               <w:rPr>
-                <w:rFonts w:hint="eastAsia"/>
+                <w:rStyle w:val="af4"/>
+                <w:noProof/>
               </w:rPr>
               <w:t>结束转码</w:t>
             </w:r>
             <w:r>
+              <w:rPr>
+                <w:rFonts w:hint="eastAsia"/>
+                <w:noProof/>
+                <w:webHidden/>
+              </w:rPr>
               <w:tab/>
             </w:r>
             <w:r>
+              <w:rPr>
+                <w:rFonts w:hint="eastAsia"/>
+                <w:noProof/>
+                <w:webHidden/>
+              </w:rPr>
               <w:fldChar w:fldCharType="begin"/>
             </w:r>
             <w:r>
-              <w:instrText xml:space="preserve"> PAGEREF _Toc8890 \h </w:instrText>
-            </w:r>
-            <w:r>
+              <w:rPr>
+                <w:rFonts w:hint="eastAsia"/>
+                <w:noProof/>
+                <w:webHidden/>
+              </w:rPr>
+              <w:instrText xml:space="preserve"> </w:instrText>
+            </w:r>
+            <w:r>
+              <w:rPr>
+                <w:noProof/>
+                <w:webHidden/>
+              </w:rPr>
+              <w:instrText>PAGEREF _Toc229756641 \h</w:instrText>
+            </w:r>
+            <w:r>
+              <w:rPr>
+                <w:rFonts w:hint="eastAsia"/>
+                <w:noProof/>
+                <w:webHidden/>
+              </w:rPr>
+              <w:instrText xml:space="preserve"> </w:instrText>
+            </w:r>
+            <w:r>
+              <w:rPr>
+                <w:rFonts w:hint="eastAsia"/>
+                <w:noProof/>
+                <w:webHidden/>
+              </w:rPr>
+            </w:r>
+            <w:r>
+              <w:rPr>
+                <w:rFonts w:hint="eastAsia"/>
+                <w:noProof/>
+                <w:webHidden/>
+              </w:rPr>
               <w:fldChar w:fldCharType="separate"/>
             </w:r>
             <w:r>
-              <w:t>5</w:t>
-            </w:r>
-            <w:r>
+              <w:rPr>
+                <w:noProof/>
+                <w:webHidden/>
+              </w:rPr>
+              <w:t>10</w:t>
+            </w:r>
+            <w:r>
+              <w:rPr>
+                <w:rFonts w:hint="eastAsia"/>
+                <w:noProof/>
+                <w:webHidden/>
+              </w:rPr>
               <w:fldChar w:fldCharType="end"/>
             </w:r>
           </w:hyperlink>
@@ -313,44 +772,104 @@
           <w:pPr>
             <w:pStyle w:val="TOC1"/>
             <w:tabs>
-              <w:tab w:val="right" w:leader="dot" w:pos="8306"/>
+              <w:tab w:val="right" w:leader="dot" w:pos="8296"/>
             </w:tabs>
+            <w:rPr>
+              <w:noProof/>
+              <w:kern w:val="2"/>
+              <w:szCs w:val="24"/>
+              <w14:ligatures w14:val="standardContextual"/>
+            </w:rPr>
           </w:pPr>
-          <w:hyperlink w:anchor="_Toc28215" w:history="1">
-            <w:r>
-              <w:rPr>
-                <w:rFonts w:hint="eastAsia"/>
+          <w:hyperlink w:anchor="_Toc229756642" w:history="1">
+            <w:r>
+              <w:rPr>
+                <w:rStyle w:val="af4"/>
+                <w:noProof/>
               </w:rPr>
               <w:t>二</w:t>
             </w:r>
             <w:r>
               <w:rPr>
-                <w:rFonts w:hint="eastAsia"/>
+                <w:rStyle w:val="af4"/>
+                <w:noProof/>
               </w:rPr>
               <w:t xml:space="preserve"> </w:t>
             </w:r>
             <w:r>
               <w:rPr>
-                <w:rFonts w:hint="eastAsia"/>
+                <w:rStyle w:val="af4"/>
+                <w:noProof/>
               </w:rPr>
               <w:t>配置文件</w:t>
             </w:r>
             <w:r>
+              <w:rPr>
+                <w:rFonts w:hint="eastAsia"/>
+                <w:noProof/>
+                <w:webHidden/>
+              </w:rPr>
               <w:tab/>
             </w:r>
             <w:r>
+              <w:rPr>
+                <w:rFonts w:hint="eastAsia"/>
+                <w:noProof/>
+                <w:webHidden/>
+              </w:rPr>
               <w:fldChar w:fldCharType="begin"/>
             </w:r>
             <w:r>
-              <w:instrText xml:space="preserve"> PAGEREF _Toc28215 \h </w:instrText>
-            </w:r>
-            <w:r>
+              <w:rPr>
+                <w:rFonts w:hint="eastAsia"/>
+                <w:noProof/>
+                <w:webHidden/>
+              </w:rPr>
+              <w:instrText xml:space="preserve"> </w:instrText>
+            </w:r>
+            <w:r>
+              <w:rPr>
+                <w:noProof/>
+                <w:webHidden/>
+              </w:rPr>
+              <w:instrText>PAGEREF _Toc229756642 \h</w:instrText>
+            </w:r>
+            <w:r>
+              <w:rPr>
+                <w:rFonts w:hint="eastAsia"/>
+                <w:noProof/>
+                <w:webHidden/>
+              </w:rPr>
+              <w:instrText xml:space="preserve"> </w:instrText>
+            </w:r>
+            <w:r>
+              <w:rPr>
+                <w:rFonts w:hint="eastAsia"/>
+                <w:noProof/>
+                <w:webHidden/>
+              </w:rPr>
+            </w:r>
+            <w:r>
+              <w:rPr>
+                <w:rFonts w:hint="eastAsia"/>
+                <w:noProof/>
+                <w:webHidden/>
+              </w:rPr>
               <w:fldChar w:fldCharType="separate"/>
             </w:r>
             <w:r>
-              <w:t>5</w:t>
-            </w:r>
-            <w:r>
+              <w:rPr>
+                <w:noProof/>
+                <w:webHidden/>
+              </w:rPr>
+              <w:t>11</w:t>
+            </w:r>
+            <w:r>
+              <w:rPr>
+                <w:rFonts w:hint="eastAsia"/>
+                <w:noProof/>
+                <w:webHidden/>
+              </w:rPr>
               <w:fldChar w:fldCharType="end"/>
             </w:r>
           </w:hyperlink>
@@ -359,32 +878,90 @@
           <w:pPr>
             <w:pStyle w:val="TOC1"/>
             <w:tabs>
-              <w:tab w:val="right" w:leader="dot" w:pos="8306"/>
+              <w:tab w:val="right" w:leader="dot" w:pos="8296"/>
             </w:tabs>
+            <w:rPr>
+              <w:noProof/>
+              <w:kern w:val="2"/>
+              <w:szCs w:val="24"/>
+              <w14:ligatures w14:val="standardContextual"/>
+            </w:rPr>
           </w:pPr>
-          <w:hyperlink w:anchor="_Toc12785" w:history="1">
-            <w:r>
-              <w:rPr>
-                <w:rFonts w:hint="eastAsia"/>
+          <w:hyperlink w:anchor="_Toc229756643" w:history="1">
+            <w:r>
+              <w:rPr>
+                <w:rStyle w:val="af4"/>
+                <w:noProof/>
               </w:rPr>
               <w:t>FAQ</w:t>
             </w:r>
             <w:r>
+              <w:rPr>
+                <w:rFonts w:hint="eastAsia"/>
+                <w:noProof/>
+                <w:webHidden/>
+              </w:rPr>
               <w:tab/>
             </w:r>
             <w:r>
+              <w:rPr>
+                <w:rFonts w:hint="eastAsia"/>
+                <w:noProof/>
+                <w:webHidden/>
+              </w:rPr>
               <w:fldChar w:fldCharType="begin"/>
             </w:r>
             <w:r>
-              <w:instrText xml:space="preserve"> PAGEREF _Toc12785 \h </w:instrText>
-            </w:r>
-            <w:r>
+              <w:rPr>
+                <w:rFonts w:hint="eastAsia"/>
+                <w:noProof/>
+                <w:webHidden/>
+              </w:rPr>
+              <w:instrText xml:space="preserve"> </w:instrText>
+            </w:r>
+            <w:r>
+              <w:rPr>
+                <w:noProof/>
+                <w:webHidden/>
+              </w:rPr>
+              <w:instrText>PAGEREF _Toc229756643 \h</w:instrText>
+            </w:r>
+            <w:r>
+              <w:rPr>
+                <w:rFonts w:hint="eastAsia"/>
+                <w:noProof/>
+                <w:webHidden/>
+              </w:rPr>
+              <w:instrText xml:space="preserve"> </w:instrText>
+            </w:r>
+            <w:r>
+              <w:rPr>
+                <w:rFonts w:hint="eastAsia"/>
+                <w:noProof/>
+                <w:webHidden/>
+              </w:rPr>
+            </w:r>
+            <w:r>
+              <w:rPr>
+                <w:rFonts w:hint="eastAsia"/>
+                <w:noProof/>
+                <w:webHidden/>
+              </w:rPr>
               <w:fldChar w:fldCharType="separate"/>
             </w:r>
             <w:r>
-              <w:t>6</w:t>
-            </w:r>
-            <w:r>
+              <w:rPr>
+                <w:noProof/>
+                <w:webHidden/>
+              </w:rPr>
+              <w:t>11</w:t>
+            </w:r>
+            <w:r>
+              <w:rPr>
+                <w:rFonts w:hint="eastAsia"/>
+                <w:noProof/>
+                <w:webHidden/>
+              </w:rPr>
               <w:fldChar w:fldCharType="end"/>
             </w:r>
           </w:hyperlink>
@@ -405,20 +982,6 @@
         </w:p>
       </w:sdtContent>
     </w:sdt>
-    <w:p>
-      <w:pPr>
-        <w:rPr>
-          <w:lang w:val="zh-CN"/>
-        </w:rPr>
-      </w:pPr>
-    </w:p>
-    <w:p>
-      <w:pPr>
-        <w:rPr>
-          <w:lang w:val="zh-CN"/>
-        </w:rPr>
-      </w:pPr>
-    </w:p>
     <w:p>
       <w:pPr>
         <w:rPr>
@@ -541,6 +1104,7 @@
           <w:p>
             <w:pPr>
               <w:pStyle w:val="afa"/>
+              <w:ind w:firstLine="210"/>
             </w:pPr>
             <w:r>
               <w:lastRenderedPageBreak/>
@@ -550,6 +1114,7 @@
           <w:p>
             <w:pPr>
               <w:pStyle w:val="afa"/>
+              <w:ind w:firstLine="210"/>
             </w:pPr>
             <w:r>
               <w:t>[</w:t>
@@ -570,6 +1135,7 @@
           <w:p>
             <w:pPr>
               <w:pStyle w:val="afa"/>
+              <w:ind w:firstLine="210"/>
             </w:pPr>
             <w:r>
               <w:t>[</w:t>
@@ -609,6 +1175,7 @@
           <w:p>
             <w:pPr>
               <w:pStyle w:val="afa"/>
+              <w:ind w:firstLine="210"/>
             </w:pPr>
             <w:r>
               <w:t>文件</w:t>
@@ -639,6 +1206,7 @@
           <w:p>
             <w:pPr>
               <w:pStyle w:val="afa"/>
+              <w:ind w:firstLine="210"/>
             </w:pPr>
             <w:r>
               <w:rPr>
@@ -669,6 +1237,7 @@
           <w:p>
             <w:pPr>
               <w:pStyle w:val="afa"/>
+              <w:ind w:firstLine="210"/>
             </w:pPr>
           </w:p>
         </w:tc>
@@ -687,6 +1256,7 @@
           <w:p>
             <w:pPr>
               <w:pStyle w:val="afa"/>
+              <w:ind w:firstLine="210"/>
             </w:pPr>
             <w:r>
               <w:t>当前版本：</w:t>
@@ -708,6 +1278,7 @@
           <w:p>
             <w:pPr>
               <w:pStyle w:val="afa"/>
+              <w:ind w:firstLine="210"/>
             </w:pPr>
             <w:r>
               <w:rPr>
@@ -719,19 +1290,19 @@
               <w:rPr>
                 <w:rFonts w:hint="eastAsia"/>
               </w:rPr>
+              <w:t>2</w:t>
+            </w:r>
+            <w:r>
+              <w:rPr>
+                <w:rFonts w:hint="eastAsia"/>
+              </w:rPr>
+              <w:t>.</w:t>
+            </w:r>
+            <w:r>
+              <w:rPr>
+                <w:rFonts w:hint="eastAsia"/>
+              </w:rPr>
               <w:t>1</w:t>
-            </w:r>
-            <w:r>
-              <w:rPr>
-                <w:rFonts w:hint="eastAsia"/>
-              </w:rPr>
-              <w:t>.</w:t>
-            </w:r>
-            <w:r>
-              <w:rPr>
-                <w:rFonts w:hint="eastAsia"/>
-              </w:rPr>
-              <w:t>3</w:t>
             </w:r>
             <w:r>
               <w:rPr>
@@ -774,6 +1345,7 @@
           <w:p>
             <w:pPr>
               <w:pStyle w:val="afa"/>
+              <w:ind w:firstLine="210"/>
             </w:pPr>
           </w:p>
         </w:tc>
@@ -792,6 +1364,7 @@
           <w:p>
             <w:pPr>
               <w:pStyle w:val="afa"/>
+              <w:ind w:firstLine="210"/>
             </w:pPr>
             <w:r>
               <w:rPr>
@@ -819,6 +1392,7 @@
           <w:p>
             <w:pPr>
               <w:pStyle w:val="afa"/>
+              <w:ind w:firstLine="210"/>
               <w:rPr>
                 <w:rFonts w:hint="eastAsia"/>
               </w:rPr>
@@ -833,7 +1407,7 @@
               <w:rPr>
                 <w:rFonts w:hint="eastAsia"/>
               </w:rPr>
-              <w:t>5</w:t>
+              <w:t>6</w:t>
             </w:r>
             <w:r>
               <w:t>-</w:t>
@@ -842,7 +1416,7 @@
               <w:rPr>
                 <w:rFonts w:hint="eastAsia"/>
               </w:rPr>
-              <w:t>12</w:t>
+              <w:t>05</w:t>
             </w:r>
             <w:r>
               <w:rPr>
@@ -854,7 +1428,7 @@
               <w:rPr>
                 <w:rFonts w:hint="eastAsia"/>
               </w:rPr>
-              <w:t>25</w:t>
+              <w:t>22</w:t>
             </w:r>
           </w:p>
         </w:tc>
@@ -881,6 +1455,7 @@
           <w:p>
             <w:pPr>
               <w:pStyle w:val="afa"/>
+              <w:ind w:firstLine="210"/>
               <w:jc w:val="center"/>
             </w:pPr>
             <w:r>
@@ -933,9 +1508,9 @@
     <w:p>
       <w:pPr>
         <w:pStyle w:val="1"/>
-      </w:pPr>
-      <w:bookmarkStart w:id="1" w:name="_Toc27204"/>
-      <w:proofErr w:type="gramStart"/>
+        <w:ind w:firstLine="281"/>
+      </w:pPr>
+      <w:bookmarkStart w:id="1" w:name="_Toc229756635"/>
       <w:r>
         <w:rPr>
           <w:rFonts w:hint="eastAsia"/>
@@ -943,7 +1518,6 @@
         <w:lastRenderedPageBreak/>
         <w:t>一</w:t>
       </w:r>
-      <w:proofErr w:type="gramEnd"/>
       <w:r>
         <w:rPr>
           <w:rFonts w:hint="eastAsia"/>
@@ -958,6 +1532,26 @@
       </w:r>
       <w:bookmarkEnd w:id="0"/>
       <w:bookmarkEnd w:id="1"/>
+    </w:p>
+    <w:p>
+      <w:r>
+        <w:rPr>
+          <w:rFonts w:hint="eastAsia"/>
+        </w:rPr>
+        <w:t xml:space="preserve">    </w:t>
+      </w:r>
+      <w:r>
+        <w:rPr>
+          <w:rFonts w:hint="eastAsia"/>
+        </w:rPr>
+        <w:t>文件概述可以参考</w:t>
+      </w:r>
+      <w:r>
+        <w:rPr>
+          <w:rFonts w:hint="eastAsia"/>
+        </w:rPr>
+        <w:t>readme</w:t>
+      </w:r>
     </w:p>
     <w:p>
       <w:pPr>
@@ -966,8 +1560,9 @@
           <w:ilvl w:val="1"/>
           <w:numId w:val="1"/>
         </w:numPr>
-      </w:pPr>
-      <w:bookmarkStart w:id="2" w:name="_Toc3075"/>
+        <w:ind w:firstLine="261"/>
+      </w:pPr>
+      <w:bookmarkStart w:id="2" w:name="_Toc229756636"/>
       <w:r>
         <w:rPr>
           <w:rFonts w:hint="eastAsia"/>
@@ -985,8 +1580,9 @@
     <w:p>
       <w:pPr>
         <w:pStyle w:val="3"/>
-      </w:pPr>
-      <w:bookmarkStart w:id="3" w:name="_Toc26402"/>
+        <w:ind w:firstLine="221"/>
+      </w:pPr>
+      <w:bookmarkStart w:id="3" w:name="_Toc229756637"/>
       <w:r>
         <w:rPr>
           <w:rFonts w:hint="eastAsia"/>
@@ -1003,7 +1599,7 @@
     </w:p>
     <w:p>
       <w:pPr>
-        <w:ind w:firstLine="440"/>
+        <w:ind w:firstLine="220"/>
       </w:pPr>
       <w:r>
         <w:rPr>
@@ -1047,17 +1643,17 @@
     </w:p>
     <w:p>
       <w:pPr>
-        <w:ind w:firstLine="440"/>
+        <w:ind w:firstLine="220"/>
       </w:pPr>
       <w:r>
         <w:rPr>
           <w:noProof/>
         </w:rPr>
         <w:drawing>
-          <wp:inline distT="0" distB="0" distL="0" distR="0" wp14:anchorId="74B819B2" wp14:editId="4FF0A3C3">
-            <wp:extent cx="5274310" cy="3706495"/>
-            <wp:effectExtent l="0" t="0" r="2540" b="8255"/>
-            <wp:docPr id="1746649265" name="图片 1" descr="图形用户界面, 应用程序&#10;&#10;AI 生成的内容可能不正确。"/>
+          <wp:inline distT="0" distB="0" distL="0" distR="0" wp14:anchorId="780C894A" wp14:editId="594DCF21">
+            <wp:extent cx="5274310" cy="3383280"/>
+            <wp:effectExtent l="0" t="0" r="2540" b="7620"/>
+            <wp:docPr id="1563407887" name="图片 1"/>
             <wp:cNvGraphicFramePr>
               <a:graphicFrameLocks xmlns:a="http://schemas.openxmlformats.org/drawingml/2006/main" noChangeAspect="1"/>
             </wp:cNvGraphicFramePr>
@@ -1065,7 +1661,7 @@
               <a:graphicData uri="http://schemas.openxmlformats.org/drawingml/2006/picture">
                 <pic:pic xmlns:pic="http://schemas.openxmlformats.org/drawingml/2006/picture">
                   <pic:nvPicPr>
-                    <pic:cNvPr id="1746649265" name="图片 1" descr="图形用户界面, 应用程序&#10;&#10;AI 生成的内容可能不正确。"/>
+                    <pic:cNvPr id="1563407887" name=""/>
                     <pic:cNvPicPr/>
                   </pic:nvPicPr>
                   <pic:blipFill>
@@ -1077,7 +1673,7 @@
                   <pic:spPr>
                     <a:xfrm>
                       <a:off x="0" y="0"/>
-                      <a:ext cx="5274310" cy="3706495"/>
+                      <a:ext cx="5274310" cy="3383280"/>
                     </a:xfrm>
                     <a:prstGeom prst="rect">
                       <a:avLst/>
@@ -1096,6 +1692,7 @@
           <w:ilvl w:val="0"/>
           <w:numId w:val="2"/>
         </w:numPr>
+        <w:ind w:firstLine="220"/>
       </w:pPr>
       <w:r>
         <w:rPr>
@@ -1168,6 +1765,35 @@
           <w:rFonts w:hint="eastAsia"/>
         </w:rPr>
         <w:t>)</w:t>
+      </w:r>
+    </w:p>
+    <w:p>
+      <w:pPr>
+        <w:ind w:left="420"/>
+        <w:rPr>
+          <w:color w:val="EE0000"/>
+        </w:rPr>
+      </w:pPr>
+      <w:r>
+        <w:rPr>
+          <w:rFonts w:hint="eastAsia"/>
+          <w:color w:val="EE0000"/>
+        </w:rPr>
+        <w:t>需要等待所有时间加载完毕才可以开始转码</w:t>
+      </w:r>
+      <w:r>
+        <w:rPr>
+          <w:rFonts w:hint="eastAsia"/>
+          <w:color w:val="EE0000"/>
+        </w:rPr>
+        <w:t>,</w:t>
+      </w:r>
+      <w:r>
+        <w:rPr>
+          <w:rFonts w:hint="eastAsia"/>
+          <w:color w:val="EE0000"/>
+        </w:rPr>
+        <w:t>否则进度会出问题</w:t>
       </w:r>
     </w:p>
     <w:p>
@@ -1176,6 +1802,7 @@
           <w:ilvl w:val="0"/>
           <w:numId w:val="2"/>
         </w:numPr>
+        <w:ind w:firstLine="220"/>
       </w:pPr>
       <w:r>
         <w:rPr>
@@ -1238,6 +1865,7 @@
           <w:ilvl w:val="0"/>
           <w:numId w:val="2"/>
         </w:numPr>
+        <w:ind w:firstLine="220"/>
       </w:pPr>
       <w:r>
         <w:rPr>
@@ -1336,12 +1964,13 @@
           <w:ilvl w:val="0"/>
           <w:numId w:val="2"/>
         </w:numPr>
-      </w:pPr>
-      <w:r>
-        <w:rPr>
-          <w:rFonts w:hint="eastAsia"/>
-        </w:rPr>
-        <w:t>剧集合并</w:t>
+        <w:ind w:firstLine="220"/>
+      </w:pPr>
+      <w:r>
+        <w:rPr>
+          <w:rFonts w:hint="eastAsia"/>
+        </w:rPr>
+        <w:t>忽略成功</w:t>
       </w:r>
       <w:r>
         <w:rPr>
@@ -1353,7 +1982,7 @@
         <w:rPr>
           <w:rFonts w:hint="eastAsia"/>
         </w:rPr>
-        <w:t>会把一个子文件夹下的所有剧集合并成一个视频文件</w:t>
+        <w:t>勾选后再次开始成功的不会被重新转码</w:t>
       </w:r>
       <w:r>
         <w:rPr>
@@ -1365,7 +1994,7 @@
         <w:rPr>
           <w:rFonts w:hint="eastAsia"/>
         </w:rPr>
-        <w:t>并且以文件夹命名</w:t>
+        <w:t>否则列表里面的视频都会转码</w:t>
       </w:r>
     </w:p>
     <w:p>
@@ -1374,6 +2003,47 @@
           <w:ilvl w:val="0"/>
           <w:numId w:val="2"/>
         </w:numPr>
+        <w:ind w:firstLine="220"/>
+      </w:pPr>
+      <w:r>
+        <w:rPr>
+          <w:rFonts w:hint="eastAsia"/>
+        </w:rPr>
+        <w:lastRenderedPageBreak/>
+        <w:t>剧集合并</w:t>
+      </w:r>
+      <w:r>
+        <w:rPr>
+          <w:rFonts w:hint="eastAsia"/>
+        </w:rPr>
+        <w:t>:</w:t>
+      </w:r>
+      <w:r>
+        <w:rPr>
+          <w:rFonts w:hint="eastAsia"/>
+        </w:rPr>
+        <w:t>会把一个子文件夹下的所有剧集合并成一个视频文件</w:t>
+      </w:r>
+      <w:r>
+        <w:rPr>
+          <w:rFonts w:hint="eastAsia"/>
+        </w:rPr>
+        <w:t>,</w:t>
+      </w:r>
+      <w:r>
+        <w:rPr>
+          <w:rFonts w:hint="eastAsia"/>
+        </w:rPr>
+        <w:t>并且以文件夹命名</w:t>
+      </w:r>
+    </w:p>
+    <w:p>
+      <w:pPr>
+        <w:numPr>
+          <w:ilvl w:val="0"/>
+          <w:numId w:val="2"/>
+        </w:numPr>
+        <w:ind w:firstLine="220"/>
       </w:pPr>
       <w:r>
         <w:rPr>
@@ -1479,7 +2149,7 @@
     </w:p>
     <w:p>
       <w:pPr>
-        <w:ind w:firstLine="440"/>
+        <w:ind w:firstLine="220"/>
         <w:rPr>
           <w:color w:val="C00000"/>
         </w:rPr>
@@ -1489,7 +2159,6 @@
           <w:rFonts w:hint="eastAsia"/>
           <w:color w:val="C00000"/>
         </w:rPr>
-        <w:lastRenderedPageBreak/>
         <w:t>注意</w:t>
       </w:r>
       <w:r>
@@ -1544,7 +2213,7 @@
     </w:p>
     <w:p>
       <w:pPr>
-        <w:ind w:firstLine="440"/>
+        <w:ind w:firstLine="220"/>
       </w:pPr>
       <w:r>
         <w:rPr>
@@ -1694,20 +2363,77 @@
     <w:p>
       <w:pPr>
         <w:pStyle w:val="3"/>
-      </w:pPr>
-      <w:bookmarkStart w:id="4" w:name="_Toc3231"/>
+        <w:ind w:firstLine="221"/>
+      </w:pPr>
+      <w:bookmarkStart w:id="4" w:name="_Toc229756638"/>
       <w:r>
         <w:rPr>
           <w:rFonts w:hint="eastAsia"/>
         </w:rPr>
         <w:t xml:space="preserve">1.1.2 </w:t>
       </w:r>
+      <w:r>
+        <w:rPr>
+          <w:rFonts w:hint="eastAsia"/>
+        </w:rPr>
+        <w:t>编码配置</w:t>
+      </w:r>
       <w:bookmarkEnd w:id="4"/>
-      <w:r>
-        <w:rPr>
-          <w:rFonts w:hint="eastAsia"/>
-        </w:rPr>
-        <w:t>编码配置</w:t>
+    </w:p>
+    <w:p>
+      <w:r>
+        <w:rPr>
+          <w:rFonts w:hint="eastAsia"/>
+        </w:rPr>
+        <w:t xml:space="preserve">   </w:t>
+      </w:r>
+      <w:r>
+        <w:rPr>
+          <w:rFonts w:hint="eastAsia"/>
+        </w:rPr>
+        <w:t>默认打开本地转码</w:t>
+      </w:r>
+      <w:r>
+        <w:rPr>
+          <w:rFonts w:hint="eastAsia"/>
+        </w:rPr>
+        <w:t>,</w:t>
+      </w:r>
+      <w:r>
+        <w:rPr>
+          <w:rFonts w:hint="eastAsia"/>
+        </w:rPr>
+        <w:t>也可以支持</w:t>
+      </w:r>
+      <w:r>
+        <w:rPr>
+          <w:rFonts w:hint="eastAsia"/>
+        </w:rPr>
+        <w:t>云转码</w:t>
+      </w:r>
+      <w:r>
+        <w:rPr>
+          <w:rFonts w:hint="eastAsia"/>
+        </w:rPr>
+        <w:t>配音</w:t>
+      </w:r>
+    </w:p>
+    <w:p>
+      <w:pPr>
+        <w:pStyle w:val="4"/>
+        <w:ind w:firstLine="221"/>
+      </w:pPr>
+      <w:r>
+        <w:rPr>
+          <w:rFonts w:hint="eastAsia"/>
+        </w:rPr>
+        <w:t xml:space="preserve">1.1.2.1 </w:t>
+      </w:r>
+      <w:r>
+        <w:rPr>
+          <w:rFonts w:hint="eastAsia"/>
+        </w:rPr>
+        <w:t>本地转码</w:t>
       </w:r>
     </w:p>
     <w:p>
@@ -1722,10 +2448,10 @@
           <w:noProof/>
         </w:rPr>
         <w:drawing>
-          <wp:inline distT="0" distB="0" distL="0" distR="0" wp14:anchorId="1CBB923C" wp14:editId="17B333A1">
-            <wp:extent cx="5274310" cy="6083300"/>
-            <wp:effectExtent l="0" t="0" r="2540" b="0"/>
-            <wp:docPr id="545953352" name="图片 1"/>
+          <wp:inline distT="0" distB="0" distL="0" distR="0" wp14:anchorId="5ABD4AE0" wp14:editId="757E1D54">
+            <wp:extent cx="5274310" cy="4434840"/>
+            <wp:effectExtent l="0" t="0" r="2540" b="3810"/>
+            <wp:docPr id="1743352053" name="图片 1"/>
             <wp:cNvGraphicFramePr>
               <a:graphicFrameLocks xmlns:a="http://schemas.openxmlformats.org/drawingml/2006/main" noChangeAspect="1"/>
             </wp:cNvGraphicFramePr>
@@ -1733,7 +2459,7 @@
               <a:graphicData uri="http://schemas.openxmlformats.org/drawingml/2006/picture">
                 <pic:pic xmlns:pic="http://schemas.openxmlformats.org/drawingml/2006/picture">
                   <pic:nvPicPr>
-                    <pic:cNvPr id="545953352" name=""/>
+                    <pic:cNvPr id="1743352053" name=""/>
                     <pic:cNvPicPr/>
                   </pic:nvPicPr>
                   <pic:blipFill>
@@ -1745,7 +2471,7 @@
                   <pic:spPr>
                     <a:xfrm>
                       <a:off x="0" y="0"/>
-                      <a:ext cx="5274310" cy="6083300"/>
+                      <a:ext cx="5274310" cy="4434840"/>
                     </a:xfrm>
                     <a:prstGeom prst="rect">
                       <a:avLst/>
@@ -1787,11 +2513,15 @@
       </w:r>
     </w:p>
     <w:p>
+      <w:pPr>
+        <w:ind w:firstLineChars="100" w:firstLine="220"/>
+      </w:pPr>
       <w:r>
         <w:rPr>
           <w:rFonts w:hint="eastAsia"/>
           <w:color w:val="0070C0"/>
         </w:rPr>
+        <w:lastRenderedPageBreak/>
         <w:t>总码率</w:t>
       </w:r>
       <w:r>
@@ -1870,8 +2600,8 @@
     </w:p>
     <w:p>
       <w:pPr>
-        <w:rPr>
-          <w:rFonts w:hint="eastAsia"/>
+        <w:ind w:firstLineChars="100" w:firstLine="220"/>
+        <w:rPr>
           <w:color w:val="548DD4" w:themeColor="text2" w:themeTint="99"/>
         </w:rPr>
       </w:pPr>
@@ -1880,7 +2610,6 @@
           <w:rFonts w:hint="eastAsia"/>
           <w:color w:val="548DD4" w:themeColor="text2" w:themeTint="99"/>
         </w:rPr>
-        <w:lastRenderedPageBreak/>
         <w:t>可以不开启编解码</w:t>
       </w:r>
       <w:r>
@@ -1956,13 +2685,48 @@
     </w:p>
     <w:p>
       <w:pPr>
-        <w:pStyle w:val="4"/>
-      </w:pPr>
-      <w:r>
-        <w:rPr>
-          <w:rFonts w:hint="eastAsia"/>
-        </w:rPr>
-        <w:t xml:space="preserve">1.1.2.1 </w:t>
+        <w:ind w:firstLineChars="100" w:firstLine="220"/>
+      </w:pPr>
+      <w:r>
+        <w:rPr>
+          <w:rFonts w:hint="eastAsia"/>
+        </w:rPr>
+        <w:t>一般情况下</w:t>
+      </w:r>
+      <w:r>
+        <w:rPr>
+          <w:rFonts w:hint="eastAsia"/>
+        </w:rPr>
+        <w:t>,</w:t>
+      </w:r>
+      <w:r>
+        <w:rPr>
+          <w:rFonts w:hint="eastAsia"/>
+        </w:rPr>
+        <w:t>你只需要修改分辨率和码率即可</w:t>
+      </w:r>
+    </w:p>
+    <w:p>
+      <w:pPr>
+        <w:pStyle w:val="5"/>
+      </w:pPr>
+      <w:r>
+        <w:rPr>
+          <w:rFonts w:hint="eastAsia"/>
+        </w:rPr>
+        <w:t>1.1.2.1</w:t>
+      </w:r>
+      <w:r>
+        <w:rPr>
+          <w:rFonts w:hint="eastAsia"/>
+        </w:rPr>
+        <w:t>.1</w:t>
+      </w:r>
+      <w:r>
+        <w:rPr>
+          <w:rFonts w:hint="eastAsia"/>
+        </w:rPr>
+        <w:t xml:space="preserve"> </w:t>
       </w:r>
       <w:r>
         <w:rPr>
@@ -1997,7 +2761,19 @@
         <w:rPr>
           <w:rFonts w:hint="eastAsia"/>
         </w:rPr>
-        <w:t>H264,</w:t>
+        <w:t>H264</w:t>
+      </w:r>
+      <w:r>
+        <w:rPr>
+          <w:rFonts w:hint="eastAsia"/>
+        </w:rPr>
+        <w:t>,h265</w:t>
+      </w:r>
+      <w:r>
+        <w:rPr>
+          <w:rFonts w:hint="eastAsia"/>
+        </w:rPr>
+        <w:t>,</w:t>
       </w:r>
       <w:r>
         <w:rPr>
@@ -2009,7 +2785,7 @@
         <w:rPr>
           <w:rFonts w:hint="eastAsia"/>
         </w:rPr>
-        <w:t>H265</w:t>
+        <w:t>av1</w:t>
       </w:r>
       <w:r>
         <w:rPr>
@@ -2032,21 +2808,7 @@
         <w:rPr>
           <w:rFonts w:hint="eastAsia"/>
         </w:rPr>
-        <w:t>(</w:t>
-      </w:r>
-      <w:proofErr w:type="spellStart"/>
-      <w:r>
-        <w:rPr>
-          <w:rFonts w:hint="eastAsia"/>
-        </w:rPr>
-        <w:t>profile,level,preset,trne</w:t>
-      </w:r>
-      <w:proofErr w:type="spellEnd"/>
-      <w:r>
-        <w:rPr>
-          <w:rFonts w:hint="eastAsia"/>
-        </w:rPr>
-        <w:t>):</w:t>
+        <w:t>(profile,level,preset,trne):</w:t>
       </w:r>
       <w:r>
         <w:rPr>
@@ -2058,9 +2820,6 @@
     <w:p>
       <w:pPr>
         <w:pStyle w:val="a"/>
-        <w:rPr>
-          <w:rFonts w:hint="eastAsia"/>
-        </w:rPr>
       </w:pPr>
       <w:r>
         <w:rPr>
@@ -2130,19 +2889,11 @@
         </w:rPr>
         <w:t>,</w:t>
       </w:r>
-      <w:proofErr w:type="gramStart"/>
-      <w:r>
-        <w:rPr>
-          <w:rFonts w:hint="eastAsia"/>
-        </w:rPr>
-        <w:t>关全部</w:t>
-      </w:r>
-      <w:proofErr w:type="gramEnd"/>
-      <w:r>
-        <w:rPr>
-          <w:rFonts w:hint="eastAsia"/>
-        </w:rPr>
-        <w:t>为</w:t>
+      <w:r>
+        <w:rPr>
+          <w:rFonts w:hint="eastAsia"/>
+        </w:rPr>
+        <w:t>关全部为</w:t>
       </w:r>
       <w:r>
         <w:rPr>
@@ -2160,9 +2911,6 @@
     <w:p>
       <w:pPr>
         <w:pStyle w:val="a"/>
-        <w:rPr>
-          <w:rFonts w:hint="eastAsia"/>
-        </w:rPr>
       </w:pPr>
       <w:r>
         <w:rPr>
@@ -2268,13 +3016,25 @@
     </w:p>
     <w:p>
       <w:pPr>
-        <w:pStyle w:val="4"/>
-      </w:pPr>
-      <w:r>
-        <w:rPr>
-          <w:rFonts w:hint="eastAsia"/>
-        </w:rPr>
-        <w:t>1.1.2.2</w:t>
+        <w:pStyle w:val="5"/>
+      </w:pPr>
+      <w:r>
+        <w:rPr>
+          <w:rFonts w:hint="eastAsia"/>
+        </w:rPr>
+        <w:t>1.1.2.</w:t>
+      </w:r>
+      <w:r>
+        <w:rPr>
+          <w:rFonts w:hint="eastAsia"/>
+        </w:rPr>
+        <w:t>1.</w:t>
+      </w:r>
+      <w:r>
+        <w:rPr>
+          <w:rFonts w:hint="eastAsia"/>
+        </w:rPr>
+        <w:t>2</w:t>
       </w:r>
       <w:r>
         <w:rPr>
@@ -2290,524 +3050,15 @@
       </w:r>
     </w:p>
     <w:p>
-      <w:pPr>
-        <w:pStyle w:val="a"/>
-      </w:pPr>
-      <w:r>
-        <w:rPr>
-          <w:rFonts w:hint="eastAsia"/>
-        </w:rPr>
-        <w:t>编码格式</w:t>
-      </w:r>
-      <w:r>
-        <w:rPr>
-          <w:rFonts w:hint="eastAsia"/>
-        </w:rPr>
-        <w:t>:</w:t>
-      </w:r>
-      <w:r>
-        <w:rPr>
-          <w:rFonts w:hint="eastAsia"/>
-        </w:rPr>
-        <w:t>支持</w:t>
-      </w:r>
-      <w:r>
-        <w:rPr>
-          <w:rFonts w:hint="eastAsia"/>
-        </w:rPr>
-        <w:t>MP2</w:t>
-      </w:r>
-      <w:r>
-        <w:rPr>
-          <w:rFonts w:hint="eastAsia"/>
-        </w:rPr>
-        <w:t>和</w:t>
-      </w:r>
-      <w:r>
-        <w:rPr>
-          <w:rFonts w:hint="eastAsia"/>
-        </w:rPr>
-        <w:t>AAC</w:t>
-      </w:r>
-    </w:p>
-    <w:p>
-      <w:pPr>
-        <w:pStyle w:val="a"/>
-      </w:pPr>
-      <w:r>
-        <w:rPr>
-          <w:rFonts w:hint="eastAsia"/>
-        </w:rPr>
-        <w:t>编码控制</w:t>
-      </w:r>
-      <w:r>
-        <w:rPr>
-          <w:rFonts w:hint="eastAsia"/>
-        </w:rPr>
-        <w:t>:</w:t>
-      </w:r>
-      <w:r>
-        <w:rPr>
-          <w:rFonts w:hint="eastAsia"/>
-        </w:rPr>
-        <w:t>同视频</w:t>
-      </w:r>
-    </w:p>
-    <w:p>
-      <w:pPr>
-        <w:pStyle w:val="a"/>
-      </w:pPr>
-      <w:r>
-        <w:rPr>
-          <w:rFonts w:hint="eastAsia"/>
-        </w:rPr>
-        <w:t>声道均衡重采样</w:t>
-      </w:r>
-      <w:r>
-        <w:rPr>
-          <w:rFonts w:hint="eastAsia"/>
-        </w:rPr>
-        <w:t>:</w:t>
-      </w:r>
-      <w:r>
-        <w:rPr>
-          <w:rFonts w:hint="eastAsia"/>
-        </w:rPr>
-        <w:t>会自动把单声道部分的音频全部转换双通道</w:t>
-      </w:r>
-    </w:p>
-    <w:p>
-      <w:pPr>
-        <w:pStyle w:val="a"/>
-        <w:rPr>
-          <w:rFonts w:hint="eastAsia"/>
-        </w:rPr>
-      </w:pPr>
-      <w:r>
-        <w:rPr>
-          <w:rFonts w:hint="eastAsia"/>
-        </w:rPr>
-        <w:t>统一音量</w:t>
-      </w:r>
-      <w:r>
-        <w:rPr>
-          <w:rFonts w:hint="eastAsia"/>
-        </w:rPr>
-        <w:t>:</w:t>
-      </w:r>
-      <w:r>
-        <w:rPr>
-          <w:rFonts w:hint="eastAsia"/>
-        </w:rPr>
-        <w:t>根据广播标准的音频大小决定</w:t>
-      </w:r>
-    </w:p>
-    <w:p>
-      <w:pPr>
-        <w:pStyle w:val="4"/>
-      </w:pPr>
-      <w:r>
-        <w:rPr>
-          <w:rFonts w:hint="eastAsia"/>
-        </w:rPr>
-        <w:t>1.1.2.3</w:t>
-      </w:r>
-      <w:r>
-        <w:rPr>
-          <w:rFonts w:hint="eastAsia"/>
-        </w:rPr>
-        <w:t xml:space="preserve"> </w:t>
-      </w:r>
-      <w:r>
-        <w:rPr>
-          <w:rFonts w:hint="eastAsia"/>
-        </w:rPr>
-        <w:t>滤镜配置</w:t>
-      </w:r>
-    </w:p>
-    <w:p>
-      <w:pPr>
-        <w:pStyle w:val="a"/>
-      </w:pPr>
-      <w:r>
-        <w:rPr>
-          <w:rFonts w:hint="eastAsia"/>
-        </w:rPr>
-        <w:t>插入文本</w:t>
-      </w:r>
-      <w:r>
-        <w:rPr>
-          <w:rFonts w:hint="eastAsia"/>
-        </w:rPr>
-        <w:t>:</w:t>
-      </w:r>
-      <w:proofErr w:type="gramStart"/>
-      <w:r>
-        <w:rPr>
-          <w:rFonts w:hint="eastAsia"/>
-        </w:rPr>
-        <w:t>勾</w:t>
-      </w:r>
-      <w:proofErr w:type="gramEnd"/>
-      <w:r>
-        <w:rPr>
-          <w:rFonts w:hint="eastAsia"/>
-        </w:rPr>
-        <w:t>选后配合主界面的过滤器使用</w:t>
-      </w:r>
-      <w:r>
-        <w:rPr>
-          <w:rFonts w:hint="eastAsia"/>
-        </w:rPr>
-        <w:t>.</w:t>
-      </w:r>
-      <w:r>
-        <w:rPr>
-          <w:rFonts w:hint="eastAsia"/>
-        </w:rPr>
-        <w:t>如果不启用过滤器的备案号不起作用</w:t>
-      </w:r>
-    </w:p>
-    <w:p>
-      <w:pPr>
-        <w:pStyle w:val="a"/>
-      </w:pPr>
-      <w:r>
-        <w:rPr>
-          <w:rFonts w:hint="eastAsia"/>
-        </w:rPr>
-        <w:t>水印图</w:t>
-      </w:r>
-      <w:r>
-        <w:rPr>
-          <w:rFonts w:hint="eastAsia"/>
-        </w:rPr>
-        <w:t>:</w:t>
-      </w:r>
-      <w:r>
-        <w:rPr>
-          <w:rFonts w:hint="eastAsia"/>
-        </w:rPr>
-        <w:t>可以在指定位置插入一张水印</w:t>
-      </w:r>
-    </w:p>
-    <w:p>
-      <w:pPr>
-        <w:pStyle w:val="a"/>
-      </w:pPr>
-      <w:r>
-        <w:rPr>
-          <w:rFonts w:hint="eastAsia"/>
-        </w:rPr>
-        <w:t>竖转横</w:t>
-      </w:r>
-      <w:r>
-        <w:rPr>
-          <w:rFonts w:hint="eastAsia"/>
-        </w:rPr>
-        <w:t>:</w:t>
-      </w:r>
-      <w:r>
-        <w:rPr>
-          <w:rFonts w:hint="eastAsia"/>
-        </w:rPr>
-        <w:t>需要选择一张背景图片</w:t>
-      </w:r>
-      <w:r>
-        <w:rPr>
-          <w:rFonts w:hint="eastAsia"/>
-        </w:rPr>
-        <w:t>,</w:t>
-      </w:r>
-      <w:r>
-        <w:rPr>
-          <w:rFonts w:hint="eastAsia"/>
-        </w:rPr>
-        <w:t>然后所有的转码都使用相同的背景图片</w:t>
-      </w:r>
-      <w:r>
-        <w:rPr>
-          <w:rFonts w:hint="eastAsia"/>
-        </w:rPr>
-        <w:t>.</w:t>
-      </w:r>
-      <w:r>
-        <w:rPr>
-          <w:rFonts w:hint="eastAsia"/>
-        </w:rPr>
-        <w:t>比如原始视频是</w:t>
-      </w:r>
-      <w:r>
-        <w:rPr>
-          <w:rFonts w:hint="eastAsia"/>
-        </w:rPr>
-        <w:t>1080x1920</w:t>
-      </w:r>
-      <w:r>
-        <w:rPr>
-          <w:rFonts w:hint="eastAsia"/>
-        </w:rPr>
-        <w:t>的格式</w:t>
-      </w:r>
-      <w:r>
-        <w:rPr>
-          <w:rFonts w:hint="eastAsia"/>
-        </w:rPr>
-        <w:t>,</w:t>
-      </w:r>
-      <w:r>
-        <w:rPr>
-          <w:rFonts w:hint="eastAsia"/>
-        </w:rPr>
-        <w:t>转换成</w:t>
-      </w:r>
-      <w:r>
-        <w:rPr>
-          <w:rFonts w:hint="eastAsia"/>
-        </w:rPr>
-        <w:t>1920x1080</w:t>
-      </w:r>
-      <w:r>
-        <w:rPr>
-          <w:rFonts w:hint="eastAsia"/>
-        </w:rPr>
-        <w:t>格式的视频</w:t>
-      </w:r>
-      <w:r>
-        <w:rPr>
-          <w:rFonts w:hint="eastAsia"/>
-        </w:rPr>
-        <w:t>.</w:t>
-      </w:r>
-      <w:r>
-        <w:rPr>
-          <w:rFonts w:hint="eastAsia"/>
-        </w:rPr>
-        <w:t>如果原始格式是</w:t>
-      </w:r>
-      <w:r>
-        <w:rPr>
-          <w:rFonts w:hint="eastAsia"/>
-        </w:rPr>
-        <w:t>1920x1080</w:t>
-      </w:r>
-      <w:r>
-        <w:rPr>
-          <w:rFonts w:hint="eastAsia"/>
-        </w:rPr>
-        <w:t>的格式</w:t>
-      </w:r>
-      <w:r>
-        <w:rPr>
-          <w:rFonts w:hint="eastAsia"/>
-        </w:rPr>
-        <w:t>,</w:t>
-      </w:r>
-      <w:r>
-        <w:rPr>
-          <w:rFonts w:hint="eastAsia"/>
-        </w:rPr>
-        <w:t>那么将</w:t>
-      </w:r>
-      <w:r>
-        <w:rPr>
-          <w:rFonts w:hint="eastAsia"/>
-        </w:rPr>
-        <w:t>无效</w:t>
-      </w:r>
-    </w:p>
-    <w:p>
-      <w:pPr>
-        <w:pStyle w:val="a"/>
-      </w:pPr>
-      <w:r>
-        <w:rPr>
-          <w:rFonts w:hint="eastAsia"/>
-        </w:rPr>
-        <w:t>字幕配置</w:t>
-      </w:r>
-      <w:r>
-        <w:rPr>
-          <w:rFonts w:hint="eastAsia"/>
-        </w:rPr>
-        <w:t>:</w:t>
-      </w:r>
-      <w:r>
-        <w:rPr>
-          <w:rFonts w:hint="eastAsia"/>
-        </w:rPr>
-        <w:t>可以自动启用字幕</w:t>
-      </w:r>
-      <w:r>
-        <w:rPr>
-          <w:rFonts w:hint="eastAsia"/>
-        </w:rPr>
-        <w:t>嵌入功能</w:t>
-      </w:r>
-      <w:r>
-        <w:rPr>
-          <w:rFonts w:hint="eastAsia"/>
-        </w:rPr>
-        <w:t>,</w:t>
-      </w:r>
-      <w:r>
-        <w:rPr>
-          <w:rFonts w:hint="eastAsia"/>
-        </w:rPr>
-        <w:t>支持</w:t>
-      </w:r>
-      <w:r>
-        <w:rPr>
-          <w:rFonts w:hint="eastAsia"/>
-        </w:rPr>
-        <w:t>SRT</w:t>
-      </w:r>
-      <w:r>
-        <w:rPr>
-          <w:rFonts w:hint="eastAsia"/>
-        </w:rPr>
-        <w:t>字幕</w:t>
-      </w:r>
-      <w:r>
-        <w:rPr>
-          <w:rFonts w:hint="eastAsia"/>
-        </w:rPr>
-        <w:t>,</w:t>
-      </w:r>
-      <w:r>
-        <w:rPr>
-          <w:rFonts w:hint="eastAsia"/>
-        </w:rPr>
-        <w:t>开启后会自动搜索当前视频的字幕</w:t>
-      </w:r>
-      <w:r>
-        <w:rPr>
-          <w:rFonts w:hint="eastAsia"/>
-        </w:rPr>
-        <w:t>,</w:t>
-      </w:r>
-      <w:r>
-        <w:rPr>
-          <w:rFonts w:hint="eastAsia"/>
-        </w:rPr>
-        <w:t>格式比如</w:t>
-      </w:r>
-      <w:r>
-        <w:rPr>
-          <w:rFonts w:hint="eastAsia"/>
-        </w:rPr>
-        <w:t xml:space="preserve"> </w:t>
-      </w:r>
-      <w:r>
-        <w:rPr>
-          <w:rFonts w:hint="eastAsia"/>
-        </w:rPr>
-        <w:t>原始视频是</w:t>
-      </w:r>
-      <w:r>
-        <w:rPr>
-          <w:rFonts w:hint="eastAsia"/>
-        </w:rPr>
-        <w:t xml:space="preserve"> </w:t>
-      </w:r>
-      <w:r>
-        <w:rPr>
-          <w:rFonts w:hint="eastAsia"/>
-        </w:rPr>
-        <w:t>测试</w:t>
-      </w:r>
-      <w:r>
-        <w:rPr>
-          <w:rFonts w:hint="eastAsia"/>
-        </w:rPr>
-        <w:t>.mp4,</w:t>
-      </w:r>
-      <w:r>
-        <w:rPr>
-          <w:rFonts w:hint="eastAsia"/>
-        </w:rPr>
-        <w:t>那么字幕必须和原始视频相同目录名称为</w:t>
-      </w:r>
-      <w:r>
-        <w:rPr>
-          <w:rFonts w:hint="eastAsia"/>
-        </w:rPr>
-        <w:t xml:space="preserve"> </w:t>
-      </w:r>
-      <w:r>
-        <w:rPr>
-          <w:rFonts w:hint="eastAsia"/>
-        </w:rPr>
-        <w:t>测试</w:t>
-      </w:r>
-      <w:r>
-        <w:rPr>
-          <w:rFonts w:hint="eastAsia"/>
-        </w:rPr>
-        <w:t>.</w:t>
-      </w:r>
-      <w:proofErr w:type="spellStart"/>
-      <w:r>
-        <w:rPr>
-          <w:rFonts w:hint="eastAsia"/>
-        </w:rPr>
-        <w:t>srt</w:t>
-      </w:r>
-      <w:proofErr w:type="spellEnd"/>
-    </w:p>
-    <w:p>
-      <w:pPr>
-        <w:pStyle w:val="3"/>
-      </w:pPr>
-      <w:r>
-        <w:rPr>
-          <w:rFonts w:hint="eastAsia"/>
-        </w:rPr>
-        <w:t xml:space="preserve">1.1.3 </w:t>
-      </w:r>
-      <w:r>
-        <w:rPr>
-          <w:rFonts w:hint="eastAsia"/>
-        </w:rPr>
-        <w:t>高级配置</w:t>
-      </w:r>
-    </w:p>
-    <w:p>
-      <w:pPr>
-        <w:rPr>
-          <w:rFonts w:hint="eastAsia"/>
-        </w:rPr>
-      </w:pPr>
-      <w:r>
-        <w:rPr>
-          <w:rFonts w:hint="eastAsia"/>
-        </w:rPr>
-        <w:t xml:space="preserve">    </w:t>
-      </w:r>
-      <w:r>
-        <w:rPr>
-          <w:rFonts w:hint="eastAsia"/>
-          <w:color w:val="8DB3E2" w:themeColor="text2" w:themeTint="66"/>
-        </w:rPr>
-        <w:t>此配置可选</w:t>
-      </w:r>
-    </w:p>
-    <w:p>
-      <w:pPr>
-        <w:rPr>
-          <w:rFonts w:hint="eastAsia"/>
-        </w:rPr>
-      </w:pPr>
       <w:r>
         <w:rPr>
           <w:noProof/>
         </w:rPr>
-        <w:lastRenderedPageBreak/>
         <w:drawing>
-          <wp:inline distT="0" distB="0" distL="0" distR="0" wp14:anchorId="2B9BC9D1" wp14:editId="5C21BE6F">
-            <wp:extent cx="5274310" cy="2498090"/>
-            <wp:effectExtent l="0" t="0" r="2540" b="0"/>
-            <wp:docPr id="110548583" name="图片 1" descr="图形用户界面, 文本, 应用程序, 电子邮件&#10;&#10;AI 生成的内容可能不正确。"/>
+          <wp:inline distT="0" distB="0" distL="0" distR="0" wp14:anchorId="7AE46E02" wp14:editId="59F347CE">
+            <wp:extent cx="5274310" cy="4434840"/>
+            <wp:effectExtent l="0" t="0" r="2540" b="3810"/>
+            <wp:docPr id="1355490040" name="图片 1"/>
             <wp:cNvGraphicFramePr>
               <a:graphicFrameLocks xmlns:a="http://schemas.openxmlformats.org/drawingml/2006/main" noChangeAspect="1"/>
             </wp:cNvGraphicFramePr>
@@ -2815,7 +3066,7 @@
               <a:graphicData uri="http://schemas.openxmlformats.org/drawingml/2006/picture">
                 <pic:pic xmlns:pic="http://schemas.openxmlformats.org/drawingml/2006/picture">
                   <pic:nvPicPr>
-                    <pic:cNvPr id="110548583" name="图片 1" descr="图形用户界面, 文本, 应用程序, 电子邮件&#10;&#10;AI 生成的内容可能不正确。"/>
+                    <pic:cNvPr id="1355490040" name=""/>
                     <pic:cNvPicPr/>
                   </pic:nvPicPr>
                   <pic:blipFill>
@@ -2827,7 +3078,7 @@
                   <pic:spPr>
                     <a:xfrm>
                       <a:off x="0" y="0"/>
-                      <a:ext cx="5274310" cy="2498090"/>
+                      <a:ext cx="5274310" cy="4434840"/>
                     </a:xfrm>
                     <a:prstGeom prst="rect">
                       <a:avLst/>
@@ -2842,12 +3093,1098 @@
     </w:p>
     <w:p>
       <w:pPr>
+        <w:pStyle w:val="a"/>
+      </w:pPr>
+      <w:r>
+        <w:rPr>
+          <w:rFonts w:hint="eastAsia"/>
+        </w:rPr>
+        <w:t>编码格式</w:t>
+      </w:r>
+      <w:r>
+        <w:rPr>
+          <w:rFonts w:hint="eastAsia"/>
+        </w:rPr>
+        <w:t>:</w:t>
+      </w:r>
+      <w:r>
+        <w:rPr>
+          <w:rFonts w:hint="eastAsia"/>
+        </w:rPr>
+        <w:t>支持</w:t>
+      </w:r>
+      <w:r>
+        <w:rPr>
+          <w:rFonts w:hint="eastAsia"/>
+        </w:rPr>
+        <w:t>MP2</w:t>
+      </w:r>
+      <w:r>
+        <w:rPr>
+          <w:rFonts w:hint="eastAsia"/>
+        </w:rPr>
+        <w:t>和</w:t>
+      </w:r>
+      <w:r>
+        <w:rPr>
+          <w:rFonts w:hint="eastAsia"/>
+        </w:rPr>
+        <w:t>AAC</w:t>
+      </w:r>
+    </w:p>
+    <w:p>
+      <w:pPr>
+        <w:pStyle w:val="a"/>
+      </w:pPr>
+      <w:r>
+        <w:rPr>
+          <w:rFonts w:hint="eastAsia"/>
+        </w:rPr>
+        <w:t>编码控制</w:t>
+      </w:r>
+      <w:r>
+        <w:rPr>
+          <w:rFonts w:hint="eastAsia"/>
+        </w:rPr>
+        <w:t>:</w:t>
+      </w:r>
+      <w:r>
+        <w:rPr>
+          <w:rFonts w:hint="eastAsia"/>
+        </w:rPr>
+        <w:t>同视频</w:t>
+      </w:r>
+    </w:p>
+    <w:p>
+      <w:pPr>
+        <w:pStyle w:val="a"/>
+      </w:pPr>
+      <w:r>
+        <w:rPr>
+          <w:rFonts w:hint="eastAsia"/>
+        </w:rPr>
+        <w:lastRenderedPageBreak/>
+        <w:t>声道均衡重采样</w:t>
+      </w:r>
+      <w:r>
+        <w:rPr>
+          <w:rFonts w:hint="eastAsia"/>
+        </w:rPr>
+        <w:t>:</w:t>
+      </w:r>
+      <w:r>
+        <w:rPr>
+          <w:rFonts w:hint="eastAsia"/>
+        </w:rPr>
+        <w:t>会自动把单声道部分的音频全部转换双通道</w:t>
+      </w:r>
+    </w:p>
+    <w:p>
+      <w:pPr>
+        <w:pStyle w:val="a"/>
+      </w:pPr>
+      <w:r>
+        <w:rPr>
+          <w:rFonts w:hint="eastAsia"/>
+        </w:rPr>
+        <w:t>统一音量</w:t>
+      </w:r>
+      <w:r>
+        <w:rPr>
+          <w:rFonts w:hint="eastAsia"/>
+        </w:rPr>
+        <w:t>:</w:t>
+      </w:r>
+      <w:r>
+        <w:rPr>
+          <w:rFonts w:hint="eastAsia"/>
+        </w:rPr>
+        <w:t>根据广播标准的音频大小决定</w:t>
+      </w:r>
+    </w:p>
+    <w:p>
+      <w:pPr>
+        <w:pStyle w:val="5"/>
+      </w:pPr>
+      <w:r>
+        <w:rPr>
+          <w:rFonts w:hint="eastAsia"/>
+        </w:rPr>
+        <w:t>1.1.</w:t>
+      </w:r>
+      <w:r>
+        <w:rPr>
+          <w:rFonts w:hint="eastAsia"/>
+        </w:rPr>
+        <w:t>2.1</w:t>
+      </w:r>
+      <w:r>
+        <w:rPr>
+          <w:rFonts w:hint="eastAsia"/>
+        </w:rPr>
+        <w:t>.3</w:t>
+      </w:r>
+      <w:r>
+        <w:rPr>
+          <w:rFonts w:hint="eastAsia"/>
+        </w:rPr>
+        <w:t xml:space="preserve"> </w:t>
+      </w:r>
+      <w:r>
+        <w:rPr>
+          <w:rFonts w:hint="eastAsia"/>
+        </w:rPr>
+        <w:t>滤镜配置</w:t>
+      </w:r>
+    </w:p>
+    <w:p>
+      <w:r>
+        <w:rPr>
+          <w:noProof/>
+        </w:rPr>
+        <w:drawing>
+          <wp:inline distT="0" distB="0" distL="0" distR="0" wp14:anchorId="682D1D44" wp14:editId="3D962D6D">
+            <wp:extent cx="5274310" cy="4434840"/>
+            <wp:effectExtent l="0" t="0" r="2540" b="3810"/>
+            <wp:docPr id="1848638376" name="图片 1"/>
+            <wp:cNvGraphicFramePr>
+              <a:graphicFrameLocks xmlns:a="http://schemas.openxmlformats.org/drawingml/2006/main" noChangeAspect="1"/>
+            </wp:cNvGraphicFramePr>
+            <a:graphic xmlns:a="http://schemas.openxmlformats.org/drawingml/2006/main">
+              <a:graphicData uri="http://schemas.openxmlformats.org/drawingml/2006/picture">
+                <pic:pic xmlns:pic="http://schemas.openxmlformats.org/drawingml/2006/picture">
+                  <pic:nvPicPr>
+                    <pic:cNvPr id="1848638376" name=""/>
+                    <pic:cNvPicPr/>
+                  </pic:nvPicPr>
+                  <pic:blipFill>
+                    <a:blip r:embed="rId11"/>
+                    <a:stretch>
+                      <a:fillRect/>
+                    </a:stretch>
+                  </pic:blipFill>
+                  <pic:spPr>
+                    <a:xfrm>
+                      <a:off x="0" y="0"/>
+                      <a:ext cx="5274310" cy="4434840"/>
+                    </a:xfrm>
+                    <a:prstGeom prst="rect">
+                      <a:avLst/>
+                    </a:prstGeom>
+                  </pic:spPr>
+                </pic:pic>
+              </a:graphicData>
+            </a:graphic>
+          </wp:inline>
+        </w:drawing>
+      </w:r>
+    </w:p>
+    <w:p>
+      <w:pPr>
+        <w:pStyle w:val="a"/>
+      </w:pPr>
+      <w:r>
+        <w:rPr>
+          <w:rFonts w:hint="eastAsia"/>
+        </w:rPr>
+        <w:t>插入文本</w:t>
+      </w:r>
+      <w:r>
+        <w:rPr>
+          <w:rFonts w:hint="eastAsia"/>
+        </w:rPr>
+        <w:t>:</w:t>
+      </w:r>
+      <w:r>
+        <w:rPr>
+          <w:rFonts w:hint="eastAsia"/>
+        </w:rPr>
+        <w:t>勾选后配合主界面的过滤器使用</w:t>
+      </w:r>
+      <w:r>
+        <w:rPr>
+          <w:rFonts w:hint="eastAsia"/>
+        </w:rPr>
+        <w:t>.</w:t>
+      </w:r>
+      <w:r>
+        <w:rPr>
+          <w:rFonts w:hint="eastAsia"/>
+        </w:rPr>
+        <w:t>如果不启用过滤器的备案号不起作用</w:t>
+      </w:r>
+    </w:p>
+    <w:p>
+      <w:pPr>
+        <w:pStyle w:val="a"/>
+      </w:pPr>
+      <w:r>
+        <w:rPr>
+          <w:rFonts w:hint="eastAsia"/>
+        </w:rPr>
+        <w:t>水印图</w:t>
+      </w:r>
+      <w:r>
+        <w:rPr>
+          <w:rFonts w:hint="eastAsia"/>
+        </w:rPr>
+        <w:t>:</w:t>
+      </w:r>
+      <w:r>
+        <w:rPr>
+          <w:rFonts w:hint="eastAsia"/>
+        </w:rPr>
+        <w:t>可以在指定位置插入一张水印</w:t>
+      </w:r>
+    </w:p>
+    <w:p>
+      <w:pPr>
+        <w:pStyle w:val="a"/>
+      </w:pPr>
+      <w:r>
+        <w:rPr>
+          <w:rFonts w:hint="eastAsia"/>
+        </w:rPr>
+        <w:t>竖转横</w:t>
+      </w:r>
+      <w:r>
+        <w:rPr>
+          <w:rFonts w:hint="eastAsia"/>
+        </w:rPr>
+        <w:t>:</w:t>
+      </w:r>
+      <w:r>
+        <w:rPr>
+          <w:rFonts w:hint="eastAsia"/>
+        </w:rPr>
+        <w:t>需要选择一张背景图片</w:t>
+      </w:r>
+      <w:r>
+        <w:rPr>
+          <w:rFonts w:hint="eastAsia"/>
+        </w:rPr>
+        <w:t>,</w:t>
+      </w:r>
+      <w:r>
+        <w:rPr>
+          <w:rFonts w:hint="eastAsia"/>
+        </w:rPr>
+        <w:t>然后所有的转码都使用相同的背景图片</w:t>
+      </w:r>
+      <w:r>
+        <w:rPr>
+          <w:rFonts w:hint="eastAsia"/>
+        </w:rPr>
+        <w:t>.</w:t>
+      </w:r>
+      <w:r>
+        <w:rPr>
+          <w:rFonts w:hint="eastAsia"/>
+        </w:rPr>
+        <w:t>比如原始视频是</w:t>
+      </w:r>
+      <w:r>
+        <w:rPr>
+          <w:rFonts w:hint="eastAsia"/>
+        </w:rPr>
+        <w:t>1080x1920</w:t>
+      </w:r>
+      <w:r>
+        <w:rPr>
+          <w:rFonts w:hint="eastAsia"/>
+        </w:rPr>
+        <w:t>的格式</w:t>
+      </w:r>
+      <w:r>
+        <w:rPr>
+          <w:rFonts w:hint="eastAsia"/>
+        </w:rPr>
+        <w:t>,</w:t>
+      </w:r>
+      <w:r>
+        <w:rPr>
+          <w:rFonts w:hint="eastAsia"/>
+        </w:rPr>
+        <w:t>转换成</w:t>
+      </w:r>
+      <w:r>
+        <w:rPr>
+          <w:rFonts w:hint="eastAsia"/>
+        </w:rPr>
+        <w:t>1920x1080</w:t>
+      </w:r>
+      <w:r>
+        <w:rPr>
+          <w:rFonts w:hint="eastAsia"/>
+        </w:rPr>
+        <w:t>格式的视频</w:t>
+      </w:r>
+      <w:r>
+        <w:rPr>
+          <w:rFonts w:hint="eastAsia"/>
+        </w:rPr>
+        <w:t>.</w:t>
+      </w:r>
+      <w:r>
+        <w:rPr>
+          <w:rFonts w:hint="eastAsia"/>
+        </w:rPr>
+        <w:t>如果原始格式是</w:t>
+      </w:r>
+      <w:r>
+        <w:rPr>
+          <w:rFonts w:hint="eastAsia"/>
+        </w:rPr>
+        <w:t>1920x1080</w:t>
+      </w:r>
+      <w:r>
+        <w:rPr>
+          <w:rFonts w:hint="eastAsia"/>
+        </w:rPr>
+        <w:t>的格式</w:t>
+      </w:r>
+      <w:r>
+        <w:rPr>
+          <w:rFonts w:hint="eastAsia"/>
+        </w:rPr>
+        <w:t>,</w:t>
+      </w:r>
+      <w:r>
+        <w:rPr>
+          <w:rFonts w:hint="eastAsia"/>
+        </w:rPr>
+        <w:t>那么将</w:t>
+      </w:r>
+      <w:r>
+        <w:rPr>
+          <w:rFonts w:hint="eastAsia"/>
+        </w:rPr>
+        <w:t>无效</w:t>
+      </w:r>
+      <w:r>
+        <w:rPr>
+          <w:rFonts w:hint="eastAsia"/>
+        </w:rPr>
+        <w:t>,</w:t>
+      </w:r>
+      <w:r>
+        <w:rPr>
+          <w:rFonts w:hint="eastAsia"/>
+        </w:rPr>
+        <w:t>图片分辨率需要和视频编码分辨率</w:t>
+      </w:r>
+      <w:r>
+        <w:rPr>
+          <w:rFonts w:hint="eastAsia"/>
+        </w:rPr>
+        <w:t>一致</w:t>
+      </w:r>
+    </w:p>
+    <w:p>
+      <w:pPr>
+        <w:pStyle w:val="a"/>
+      </w:pPr>
+      <w:r>
+        <w:rPr>
+          <w:rFonts w:hint="eastAsia"/>
+        </w:rPr>
+        <w:t>字幕配置</w:t>
+      </w:r>
+      <w:r>
+        <w:rPr>
+          <w:rFonts w:hint="eastAsia"/>
+        </w:rPr>
+        <w:t>:</w:t>
+      </w:r>
+      <w:r>
+        <w:rPr>
+          <w:rFonts w:hint="eastAsia"/>
+        </w:rPr>
+        <w:t>可以自动启用字幕</w:t>
+      </w:r>
+      <w:r>
+        <w:rPr>
+          <w:rFonts w:hint="eastAsia"/>
+        </w:rPr>
+        <w:t>嵌入功能</w:t>
+      </w:r>
+      <w:r>
+        <w:rPr>
+          <w:rFonts w:hint="eastAsia"/>
+        </w:rPr>
+        <w:t>,</w:t>
+      </w:r>
+      <w:r>
+        <w:rPr>
+          <w:rFonts w:hint="eastAsia"/>
+        </w:rPr>
+        <w:t>支持</w:t>
+      </w:r>
+      <w:r>
+        <w:rPr>
+          <w:rFonts w:hint="eastAsia"/>
+        </w:rPr>
+        <w:t>SRT</w:t>
+      </w:r>
+      <w:r>
+        <w:rPr>
+          <w:rFonts w:hint="eastAsia"/>
+        </w:rPr>
+        <w:t>字幕</w:t>
+      </w:r>
+      <w:r>
+        <w:rPr>
+          <w:rFonts w:hint="eastAsia"/>
+        </w:rPr>
+        <w:t>,</w:t>
+      </w:r>
+      <w:r>
+        <w:rPr>
+          <w:rFonts w:hint="eastAsia"/>
+        </w:rPr>
+        <w:t>开启后会自动搜索当前视频的字幕</w:t>
+      </w:r>
+      <w:r>
+        <w:rPr>
+          <w:rFonts w:hint="eastAsia"/>
+        </w:rPr>
+        <w:t>,</w:t>
+      </w:r>
+      <w:r>
+        <w:rPr>
+          <w:rFonts w:hint="eastAsia"/>
+        </w:rPr>
+        <w:t>格式比如</w:t>
+      </w:r>
+      <w:r>
+        <w:rPr>
+          <w:rFonts w:hint="eastAsia"/>
+        </w:rPr>
+        <w:t xml:space="preserve"> </w:t>
+      </w:r>
+      <w:r>
+        <w:rPr>
+          <w:rFonts w:hint="eastAsia"/>
+        </w:rPr>
+        <w:t>原始视频是</w:t>
+      </w:r>
+      <w:r>
+        <w:rPr>
+          <w:rFonts w:hint="eastAsia"/>
+        </w:rPr>
+        <w:t xml:space="preserve"> </w:t>
+      </w:r>
+      <w:r>
+        <w:rPr>
+          <w:rFonts w:hint="eastAsia"/>
+        </w:rPr>
+        <w:t>测试</w:t>
+      </w:r>
+      <w:r>
+        <w:rPr>
+          <w:rFonts w:hint="eastAsia"/>
+        </w:rPr>
+        <w:t>.mp4,</w:t>
+      </w:r>
+      <w:r>
+        <w:rPr>
+          <w:rFonts w:hint="eastAsia"/>
+        </w:rPr>
+        <w:t>那么字幕必须和原始视频相同目录名称为</w:t>
+      </w:r>
+      <w:r>
+        <w:rPr>
+          <w:rFonts w:hint="eastAsia"/>
+        </w:rPr>
+        <w:t xml:space="preserve"> </w:t>
+      </w:r>
+      <w:r>
+        <w:rPr>
+          <w:rFonts w:hint="eastAsia"/>
+        </w:rPr>
+        <w:t>测试</w:t>
+      </w:r>
+      <w:r>
+        <w:rPr>
+          <w:rFonts w:hint="eastAsia"/>
+        </w:rPr>
+        <w:t>.</w:t>
+      </w:r>
+      <w:r>
+        <w:rPr>
+          <w:rFonts w:hint="eastAsia"/>
+        </w:rPr>
+        <w:t>srt</w:t>
+      </w:r>
+    </w:p>
+    <w:p>
+      <w:pPr>
+        <w:pStyle w:val="5"/>
+      </w:pPr>
+      <w:r>
+        <w:rPr>
+          <w:rFonts w:hint="eastAsia"/>
+        </w:rPr>
+        <w:lastRenderedPageBreak/>
+        <w:t xml:space="preserve">1.1.2.1.4 </w:t>
+      </w:r>
+      <w:r>
+        <w:rPr>
+          <w:rFonts w:hint="eastAsia"/>
+        </w:rPr>
+        <w:t>多码率</w:t>
+      </w:r>
+    </w:p>
+    <w:p>
+      <w:r>
+        <w:rPr>
+          <w:noProof/>
+        </w:rPr>
+        <w:drawing>
+          <wp:inline distT="0" distB="0" distL="0" distR="0" wp14:anchorId="3334555B" wp14:editId="41BE42E1">
+            <wp:extent cx="5274310" cy="4434840"/>
+            <wp:effectExtent l="0" t="0" r="2540" b="3810"/>
+            <wp:docPr id="1737840048" name="图片 1"/>
+            <wp:cNvGraphicFramePr>
+              <a:graphicFrameLocks xmlns:a="http://schemas.openxmlformats.org/drawingml/2006/main" noChangeAspect="1"/>
+            </wp:cNvGraphicFramePr>
+            <a:graphic xmlns:a="http://schemas.openxmlformats.org/drawingml/2006/main">
+              <a:graphicData uri="http://schemas.openxmlformats.org/drawingml/2006/picture">
+                <pic:pic xmlns:pic="http://schemas.openxmlformats.org/drawingml/2006/picture">
+                  <pic:nvPicPr>
+                    <pic:cNvPr id="1737840048" name=""/>
+                    <pic:cNvPicPr/>
+                  </pic:nvPicPr>
+                  <pic:blipFill>
+                    <a:blip r:embed="rId12"/>
+                    <a:stretch>
+                      <a:fillRect/>
+                    </a:stretch>
+                  </pic:blipFill>
+                  <pic:spPr>
+                    <a:xfrm>
+                      <a:off x="0" y="0"/>
+                      <a:ext cx="5274310" cy="4434840"/>
+                    </a:xfrm>
+                    <a:prstGeom prst="rect">
+                      <a:avLst/>
+                    </a:prstGeom>
+                  </pic:spPr>
+                </pic:pic>
+              </a:graphicData>
+            </a:graphic>
+          </wp:inline>
+        </w:drawing>
+      </w:r>
+    </w:p>
+    <w:p>
+      <w:r>
+        <w:rPr>
+          <w:rFonts w:hint="eastAsia"/>
+        </w:rPr>
+        <w:t>多码率转码需要使用</w:t>
+      </w:r>
+      <w:r>
+        <w:rPr>
+          <w:rFonts w:hint="eastAsia"/>
+        </w:rPr>
+        <w:t>m3u8</w:t>
+      </w:r>
+      <w:r>
+        <w:rPr>
+          <w:rFonts w:hint="eastAsia"/>
+        </w:rPr>
+        <w:t>才可以使用</w:t>
+      </w:r>
+      <w:r>
+        <w:rPr>
+          <w:rFonts w:hint="eastAsia"/>
+        </w:rPr>
+        <w:t>,</w:t>
+      </w:r>
+      <w:r>
+        <w:rPr>
+          <w:rFonts w:hint="eastAsia"/>
+        </w:rPr>
+        <w:t>多码率是多切片输出</w:t>
+      </w:r>
+      <w:r>
+        <w:rPr>
+          <w:rFonts w:hint="eastAsia"/>
+        </w:rPr>
+        <w:t>.</w:t>
+      </w:r>
+      <w:r>
+        <w:rPr>
+          <w:rFonts w:hint="eastAsia"/>
+        </w:rPr>
+        <w:t>支持分级目录和同目录输出</w:t>
+      </w:r>
+      <w:r>
+        <w:rPr>
+          <w:rFonts w:hint="eastAsia"/>
+        </w:rPr>
+        <w:t>.</w:t>
+      </w:r>
+    </w:p>
+    <w:p>
+      <w:r>
+        <w:rPr>
+          <w:rFonts w:hint="eastAsia"/>
+        </w:rPr>
+        <w:t>多码率切片可以加减</w:t>
+      </w:r>
+      <w:r>
+        <w:rPr>
+          <w:rFonts w:hint="eastAsia"/>
+        </w:rPr>
+        <w:t>,</w:t>
+      </w:r>
+      <w:r>
+        <w:rPr>
+          <w:rFonts w:hint="eastAsia"/>
+        </w:rPr>
+        <w:t>对于一些网站提供者是最好的</w:t>
+      </w:r>
+      <w:r>
+        <w:rPr>
+          <w:rFonts w:hint="eastAsia"/>
+        </w:rPr>
+        <w:t>,</w:t>
+      </w:r>
+      <w:r>
+        <w:rPr>
+          <w:rFonts w:hint="eastAsia"/>
+        </w:rPr>
+        <w:t>你可以自己修改每个切片配置</w:t>
+      </w:r>
+      <w:r>
+        <w:rPr>
+          <w:rFonts w:hint="eastAsia"/>
+        </w:rPr>
+        <w:t>,</w:t>
+      </w:r>
+      <w:r>
+        <w:rPr>
+          <w:rFonts w:hint="eastAsia"/>
+        </w:rPr>
+        <w:t>可以输出多种码率格式每次配置完毕后切换切片和确定会自动保存你修改的配置信息</w:t>
+      </w:r>
+    </w:p>
+    <w:p>
+      <w:pPr>
         <w:pStyle w:val="4"/>
       </w:pPr>
       <w:r>
         <w:rPr>
           <w:rFonts w:hint="eastAsia"/>
         </w:rPr>
+        <w:lastRenderedPageBreak/>
+        <w:t xml:space="preserve">1.1.2.2 </w:t>
+      </w:r>
+      <w:r>
+        <w:rPr>
+          <w:rFonts w:hint="eastAsia"/>
+        </w:rPr>
+        <w:t>云转码</w:t>
+      </w:r>
+    </w:p>
+    <w:p>
+      <w:r>
+        <w:rPr>
+          <w:rFonts w:hint="eastAsia"/>
+        </w:rPr>
+        <w:t xml:space="preserve">    </w:t>
+      </w:r>
+      <w:r>
+        <w:rPr>
+          <w:noProof/>
+        </w:rPr>
+        <w:drawing>
+          <wp:inline distT="0" distB="0" distL="0" distR="0" wp14:anchorId="66A3BECA" wp14:editId="00AB0BB6">
+            <wp:extent cx="5274310" cy="4434840"/>
+            <wp:effectExtent l="0" t="0" r="2540" b="3810"/>
+            <wp:docPr id="1876739144" name="图片 1"/>
+            <wp:cNvGraphicFramePr>
+              <a:graphicFrameLocks xmlns:a="http://schemas.openxmlformats.org/drawingml/2006/main" noChangeAspect="1"/>
+            </wp:cNvGraphicFramePr>
+            <a:graphic xmlns:a="http://schemas.openxmlformats.org/drawingml/2006/main">
+              <a:graphicData uri="http://schemas.openxmlformats.org/drawingml/2006/picture">
+                <pic:pic xmlns:pic="http://schemas.openxmlformats.org/drawingml/2006/picture">
+                  <pic:nvPicPr>
+                    <pic:cNvPr id="1876739144" name=""/>
+                    <pic:cNvPicPr/>
+                  </pic:nvPicPr>
+                  <pic:blipFill>
+                    <a:blip r:embed="rId13"/>
+                    <a:stretch>
+                      <a:fillRect/>
+                    </a:stretch>
+                  </pic:blipFill>
+                  <pic:spPr>
+                    <a:xfrm>
+                      <a:off x="0" y="0"/>
+                      <a:ext cx="5274310" cy="4434840"/>
+                    </a:xfrm>
+                    <a:prstGeom prst="rect">
+                      <a:avLst/>
+                    </a:prstGeom>
+                  </pic:spPr>
+                </pic:pic>
+              </a:graphicData>
+            </a:graphic>
+          </wp:inline>
+        </w:drawing>
+      </w:r>
+    </w:p>
+    <w:p>
+      <w:r>
+        <w:rPr>
+          <w:rFonts w:hint="eastAsia"/>
+        </w:rPr>
+        <w:t>云转码目前仅支持云配音</w:t>
+      </w:r>
+      <w:r>
+        <w:rPr>
+          <w:rFonts w:hint="eastAsia"/>
+        </w:rPr>
+        <w:t>,</w:t>
+      </w:r>
+      <w:r>
+        <w:rPr>
+          <w:rFonts w:hint="eastAsia"/>
+        </w:rPr>
+        <w:t>支持腾讯云接口</w:t>
+      </w:r>
+    </w:p>
+    <w:p>
+      <w:r>
+        <w:rPr>
+          <w:rFonts w:hint="eastAsia"/>
+        </w:rPr>
+        <w:t>你需要再云端配置修改保存后才可以使用</w:t>
+      </w:r>
+    </w:p>
+    <w:p>
+      <w:r>
+        <w:rPr>
+          <w:noProof/>
+        </w:rPr>
+        <w:lastRenderedPageBreak/>
+        <w:drawing>
+          <wp:inline distT="0" distB="0" distL="0" distR="0" wp14:anchorId="1611F3CB" wp14:editId="4AD509BC">
+            <wp:extent cx="5274310" cy="4434840"/>
+            <wp:effectExtent l="0" t="0" r="2540" b="3810"/>
+            <wp:docPr id="1019013664" name="图片 1"/>
+            <wp:cNvGraphicFramePr>
+              <a:graphicFrameLocks xmlns:a="http://schemas.openxmlformats.org/drawingml/2006/main" noChangeAspect="1"/>
+            </wp:cNvGraphicFramePr>
+            <a:graphic xmlns:a="http://schemas.openxmlformats.org/drawingml/2006/main">
+              <a:graphicData uri="http://schemas.openxmlformats.org/drawingml/2006/picture">
+                <pic:pic xmlns:pic="http://schemas.openxmlformats.org/drawingml/2006/picture">
+                  <pic:nvPicPr>
+                    <pic:cNvPr id="1019013664" name=""/>
+                    <pic:cNvPicPr/>
+                  </pic:nvPicPr>
+                  <pic:blipFill>
+                    <a:blip r:embed="rId14"/>
+                    <a:stretch>
+                      <a:fillRect/>
+                    </a:stretch>
+                  </pic:blipFill>
+                  <pic:spPr>
+                    <a:xfrm>
+                      <a:off x="0" y="0"/>
+                      <a:ext cx="5274310" cy="4434840"/>
+                    </a:xfrm>
+                    <a:prstGeom prst="rect">
+                      <a:avLst/>
+                    </a:prstGeom>
+                  </pic:spPr>
+                </pic:pic>
+              </a:graphicData>
+            </a:graphic>
+          </wp:inline>
+        </w:drawing>
+      </w:r>
+    </w:p>
+    <w:p>
+      <w:r>
+        <w:rPr>
+          <w:rFonts w:hint="eastAsia"/>
+        </w:rPr>
+        <w:t>秘钥</w:t>
+      </w:r>
+      <w:r>
+        <w:rPr>
+          <w:rFonts w:hint="eastAsia"/>
+        </w:rPr>
+        <w:t>ID</w:t>
+      </w:r>
+      <w:r>
+        <w:rPr>
+          <w:rFonts w:hint="eastAsia"/>
+        </w:rPr>
+        <w:t>和秘钥</w:t>
+      </w:r>
+      <w:r>
+        <w:rPr>
+          <w:rFonts w:hint="eastAsia"/>
+        </w:rPr>
+        <w:t>key</w:t>
+      </w:r>
+      <w:r>
+        <w:rPr>
+          <w:rFonts w:hint="eastAsia"/>
+        </w:rPr>
+        <w:t>是你自己的</w:t>
+      </w:r>
+      <w:r>
+        <w:rPr>
+          <w:rFonts w:hint="eastAsia"/>
+        </w:rPr>
+        <w:t>API</w:t>
+      </w:r>
+      <w:r>
+        <w:rPr>
+          <w:rFonts w:hint="eastAsia"/>
+        </w:rPr>
+        <w:t>申请的</w:t>
+      </w:r>
+    </w:p>
+    <w:p>
+      <w:pPr>
+        <w:pStyle w:val="a"/>
+      </w:pPr>
+      <w:r>
+        <w:rPr>
+          <w:rFonts w:hint="eastAsia"/>
+        </w:rPr>
+        <w:t>映射</w:t>
+      </w:r>
+      <w:r>
+        <w:rPr>
+          <w:rFonts w:hint="eastAsia"/>
+        </w:rPr>
+        <w:t>地址</w:t>
+      </w:r>
+      <w:r>
+        <w:rPr>
+          <w:rFonts w:hint="eastAsia"/>
+        </w:rPr>
+        <w:t>:</w:t>
+      </w:r>
+      <w:r>
+        <w:rPr>
+          <w:rFonts w:hint="eastAsia"/>
+        </w:rPr>
+        <w:t>是你的腾讯云配置的地址</w:t>
+      </w:r>
+      <w:r>
+        <w:rPr>
+          <w:rFonts w:hint="eastAsia"/>
+        </w:rPr>
+        <w:t>,</w:t>
+      </w:r>
+      <w:r>
+        <w:rPr>
+          <w:rFonts w:hint="eastAsia"/>
+        </w:rPr>
+        <w:t>转码完毕下载会拼接这个地址</w:t>
+      </w:r>
+    </w:p>
+    <w:p>
+      <w:pPr>
+        <w:pStyle w:val="a"/>
+      </w:pPr>
+      <w:r>
+        <w:rPr>
+          <w:rFonts w:hint="eastAsia"/>
+        </w:rPr>
+        <w:t>本地地址</w:t>
+      </w:r>
+      <w:r>
+        <w:rPr>
+          <w:rFonts w:hint="eastAsia"/>
+        </w:rPr>
+        <w:t>:</w:t>
+      </w:r>
+      <w:r>
+        <w:rPr>
+          <w:rFonts w:hint="eastAsia"/>
+        </w:rPr>
+        <w:t>是你提供给腾讯云转码下载的地址</w:t>
+      </w:r>
+    </w:p>
+    <w:p>
+      <w:pPr>
+        <w:pStyle w:val="a"/>
+      </w:pPr>
+      <w:r>
+        <w:rPr>
+          <w:rFonts w:hint="eastAsia"/>
+        </w:rPr>
+        <w:t>磁盘目录</w:t>
+      </w:r>
+      <w:r>
+        <w:rPr>
+          <w:rFonts w:hint="eastAsia"/>
+        </w:rPr>
+        <w:t>:</w:t>
+      </w:r>
+      <w:r>
+        <w:rPr>
+          <w:rFonts w:hint="eastAsia"/>
+        </w:rPr>
+        <w:t>是你本地地址</w:t>
+      </w:r>
+      <w:r>
+        <w:rPr>
+          <w:rFonts w:hint="eastAsia"/>
+        </w:rPr>
+        <w:t>ROOT</w:t>
+      </w:r>
+      <w:r>
+        <w:rPr>
+          <w:rFonts w:hint="eastAsia"/>
+        </w:rPr>
+        <w:t>目录</w:t>
+      </w:r>
+      <w:r>
+        <w:rPr>
+          <w:rFonts w:hint="eastAsia"/>
+        </w:rPr>
+        <w:t>,</w:t>
+      </w:r>
+      <w:r>
+        <w:rPr>
+          <w:rFonts w:hint="eastAsia"/>
+        </w:rPr>
+        <w:t>这个目录地址在提交给腾讯会会被忽略</w:t>
+      </w:r>
+    </w:p>
+    <w:p>
+      <w:pPr>
+        <w:pStyle w:val="a"/>
+      </w:pPr>
+      <w:r>
+        <w:rPr>
+          <w:rFonts w:hint="eastAsia"/>
+        </w:rPr>
+        <w:t>输出配置</w:t>
+      </w:r>
+      <w:r>
+        <w:rPr>
+          <w:rFonts w:hint="eastAsia"/>
+        </w:rPr>
+        <w:t>:</w:t>
+      </w:r>
+      <w:r>
+        <w:rPr>
+          <w:rFonts w:hint="eastAsia"/>
+        </w:rPr>
+        <w:t>目前转码完毕是输出到腾讯云的</w:t>
+      </w:r>
+      <w:r>
+        <w:rPr>
+          <w:rFonts w:hint="eastAsia"/>
+        </w:rPr>
+        <w:t>bucket,</w:t>
+      </w:r>
+      <w:r>
+        <w:rPr>
+          <w:rFonts w:hint="eastAsia"/>
+        </w:rPr>
+        <w:t>然后转码工具会自动去下载</w:t>
+      </w:r>
+    </w:p>
+    <w:p>
+      <w:pPr>
+        <w:pStyle w:val="3"/>
+        <w:ind w:firstLine="221"/>
+      </w:pPr>
+      <w:bookmarkStart w:id="5" w:name="_Toc229756639"/>
+      <w:r>
+        <w:rPr>
+          <w:rFonts w:hint="eastAsia"/>
+        </w:rPr>
+        <w:t xml:space="preserve">1.1.3 </w:t>
+      </w:r>
+      <w:r>
+        <w:rPr>
+          <w:rFonts w:hint="eastAsia"/>
+        </w:rPr>
+        <w:t>高级配置</w:t>
+      </w:r>
+      <w:bookmarkEnd w:id="5"/>
+    </w:p>
+    <w:p>
+      <w:r>
+        <w:rPr>
+          <w:rFonts w:hint="eastAsia"/>
+        </w:rPr>
+        <w:t xml:space="preserve">    </w:t>
+      </w:r>
+      <w:r>
+        <w:rPr>
+          <w:rFonts w:hint="eastAsia"/>
+          <w:color w:val="8DB3E2" w:themeColor="text2" w:themeTint="66"/>
+        </w:rPr>
+        <w:t>此配置可选</w:t>
+      </w:r>
+    </w:p>
+    <w:p>
+      <w:r>
+        <w:rPr>
+          <w:noProof/>
+        </w:rPr>
+        <w:lastRenderedPageBreak/>
+        <w:drawing>
+          <wp:inline distT="0" distB="0" distL="0" distR="0" wp14:anchorId="444B124A" wp14:editId="6B12F78E">
+            <wp:extent cx="5274310" cy="3992880"/>
+            <wp:effectExtent l="0" t="0" r="2540" b="7620"/>
+            <wp:docPr id="2097790879" name="图片 1"/>
+            <wp:cNvGraphicFramePr>
+              <a:graphicFrameLocks xmlns:a="http://schemas.openxmlformats.org/drawingml/2006/main" noChangeAspect="1"/>
+            </wp:cNvGraphicFramePr>
+            <a:graphic xmlns:a="http://schemas.openxmlformats.org/drawingml/2006/main">
+              <a:graphicData uri="http://schemas.openxmlformats.org/drawingml/2006/picture">
+                <pic:pic xmlns:pic="http://schemas.openxmlformats.org/drawingml/2006/picture">
+                  <pic:nvPicPr>
+                    <pic:cNvPr id="2097790879" name=""/>
+                    <pic:cNvPicPr/>
+                  </pic:nvPicPr>
+                  <pic:blipFill>
+                    <a:blip r:embed="rId15"/>
+                    <a:stretch>
+                      <a:fillRect/>
+                    </a:stretch>
+                  </pic:blipFill>
+                  <pic:spPr>
+                    <a:xfrm>
+                      <a:off x="0" y="0"/>
+                      <a:ext cx="5274310" cy="3992880"/>
+                    </a:xfrm>
+                    <a:prstGeom prst="rect">
+                      <a:avLst/>
+                    </a:prstGeom>
+                  </pic:spPr>
+                </pic:pic>
+              </a:graphicData>
+            </a:graphic>
+          </wp:inline>
+        </w:drawing>
+      </w:r>
+    </w:p>
+    <w:p>
+      <w:pPr>
+        <w:pStyle w:val="4"/>
+        <w:ind w:firstLine="221"/>
+      </w:pPr>
+      <w:r>
+        <w:rPr>
+          <w:rFonts w:hint="eastAsia"/>
+        </w:rPr>
         <w:t xml:space="preserve">1.1.3.1 </w:t>
       </w:r>
       <w:r>
@@ -2872,9 +4209,6 @@
     <w:p>
       <w:pPr>
         <w:pStyle w:val="a"/>
-        <w:rPr>
-          <w:rFonts w:hint="eastAsia"/>
-        </w:rPr>
       </w:pPr>
       <w:r>
         <w:rPr>
@@ -2898,6 +4232,7 @@
     <w:p>
       <w:pPr>
         <w:pStyle w:val="4"/>
+        <w:ind w:firstLine="221"/>
       </w:pPr>
       <w:r>
         <w:rPr>
@@ -2927,9 +4262,6 @@
     <w:p>
       <w:pPr>
         <w:pStyle w:val="a"/>
-        <w:rPr>
-          <w:rFonts w:hint="eastAsia"/>
-        </w:rPr>
       </w:pPr>
       <w:r>
         <w:rPr>
@@ -2947,19 +4279,7 @@
         <w:rPr>
           <w:rFonts w:hint="eastAsia"/>
         </w:rPr>
-        <w:t>根据真实</w:t>
-      </w:r>
-      <w:r>
-        <w:rPr>
-          <w:rFonts w:hint="eastAsia"/>
-        </w:rPr>
-        <w:t>音频</w:t>
-      </w:r>
-      <w:r>
-        <w:rPr>
-          <w:rFonts w:hint="eastAsia"/>
-        </w:rPr>
-        <w:t>时长修复原始视频封包问题</w:t>
+        <w:t>根据真实音频时长修复原始视频封包问题</w:t>
       </w:r>
       <w:r>
         <w:rPr>
@@ -2976,9 +4296,77 @@
     </w:p>
     <w:p>
       <w:pPr>
+        <w:pStyle w:val="4"/>
+      </w:pPr>
+      <w:r>
+        <w:rPr>
+          <w:rFonts w:hint="eastAsia"/>
+        </w:rPr>
+        <w:t xml:space="preserve">1.1.3.3 </w:t>
+      </w:r>
+      <w:r>
+        <w:rPr>
+          <w:rFonts w:hint="eastAsia"/>
+        </w:rPr>
+        <w:t>加解密配置</w:t>
+      </w:r>
+    </w:p>
+    <w:p>
+      <w:r>
+        <w:rPr>
+          <w:rFonts w:hint="eastAsia"/>
+        </w:rPr>
+        <w:t xml:space="preserve">    </w:t>
+      </w:r>
+      <w:r>
+        <w:rPr>
+          <w:rFonts w:hint="eastAsia"/>
+        </w:rPr>
+        <w:t>我们支持对视频加解密</w:t>
+      </w:r>
+      <w:r>
+        <w:rPr>
+          <w:rFonts w:hint="eastAsia"/>
+        </w:rPr>
+        <w:t>,</w:t>
+      </w:r>
+      <w:r>
+        <w:rPr>
+          <w:rFonts w:hint="eastAsia"/>
+        </w:rPr>
+        <w:t>必须通过我们的工具才能解密观看</w:t>
+      </w:r>
+      <w:r>
+        <w:rPr>
+          <w:rFonts w:hint="eastAsia"/>
+        </w:rPr>
+        <w:t>,</w:t>
+      </w:r>
+      <w:r>
+        <w:rPr>
+          <w:rFonts w:hint="eastAsia"/>
+        </w:rPr>
+        <w:t>不破坏封包</w:t>
+      </w:r>
+      <w:r>
+        <w:rPr>
+          <w:rFonts w:hint="eastAsia"/>
+        </w:rPr>
+        <w:t>.</w:t>
+      </w:r>
+      <w:r>
+        <w:rPr>
+          <w:rFonts w:hint="eastAsia"/>
+        </w:rPr>
+        <w:t>只加密负载音视频数据</w:t>
+      </w:r>
+    </w:p>
+    <w:p>
+      <w:pPr>
         <w:pStyle w:val="2"/>
-      </w:pPr>
-      <w:bookmarkStart w:id="5" w:name="_Toc20431"/>
+        <w:ind w:firstLine="261"/>
+      </w:pPr>
+      <w:bookmarkStart w:id="6" w:name="_Toc229756640"/>
       <w:r>
         <w:rPr>
           <w:rFonts w:hint="eastAsia"/>
@@ -2991,11 +4379,11 @@
         </w:rPr>
         <w:t>开始转码</w:t>
       </w:r>
-      <w:bookmarkEnd w:id="5"/>
-    </w:p>
-    <w:p>
-      <w:pPr>
-        <w:ind w:firstLine="440"/>
+      <w:bookmarkEnd w:id="6"/>
+    </w:p>
+    <w:p>
+      <w:pPr>
+        <w:ind w:firstLineChars="200" w:firstLine="440"/>
       </w:pPr>
       <w:r>
         <w:rPr>
@@ -3031,8 +4419,9 @@
     <w:p>
       <w:pPr>
         <w:pStyle w:val="2"/>
-      </w:pPr>
-      <w:bookmarkStart w:id="6" w:name="_Toc8890"/>
+        <w:ind w:firstLine="261"/>
+      </w:pPr>
+      <w:bookmarkStart w:id="7" w:name="_Toc229756641"/>
       <w:r>
         <w:rPr>
           <w:rFonts w:hint="eastAsia"/>
@@ -3045,7 +4434,7 @@
         </w:rPr>
         <w:t>结束转码</w:t>
       </w:r>
-      <w:bookmarkEnd w:id="6"/>
+      <w:bookmarkEnd w:id="7"/>
     </w:p>
     <w:p>
       <w:r>
@@ -3088,12 +4477,14 @@
     <w:p>
       <w:pPr>
         <w:pStyle w:val="1"/>
-      </w:pPr>
-      <w:bookmarkStart w:id="7" w:name="_Toc28215"/>
-      <w:r>
-        <w:rPr>
-          <w:rFonts w:hint="eastAsia"/>
-        </w:rPr>
+        <w:ind w:firstLine="281"/>
+      </w:pPr>
+      <w:bookmarkStart w:id="8" w:name="_Toc229756642"/>
+      <w:r>
+        <w:rPr>
+          <w:rFonts w:hint="eastAsia"/>
+        </w:rPr>
+        <w:lastRenderedPageBreak/>
         <w:t>二</w:t>
       </w:r>
       <w:r>
@@ -3102,26 +4493,145 @@
         </w:rPr>
         <w:t xml:space="preserve"> </w:t>
       </w:r>
-      <w:r>
-        <w:rPr>
-          <w:rFonts w:hint="eastAsia"/>
-        </w:rPr>
-        <w:t>配置文件</w:t>
-      </w:r>
-      <w:bookmarkEnd w:id="7"/>
+      <w:bookmarkEnd w:id="8"/>
+      <w:r>
+        <w:rPr>
+          <w:rFonts w:hint="eastAsia"/>
+        </w:rPr>
+        <w:t>转码服务</w:t>
+      </w:r>
+    </w:p>
+    <w:p>
+      <w:pPr>
+        <w:ind w:firstLine="435"/>
+      </w:pPr>
+      <w:r>
+        <w:rPr>
+          <w:rFonts w:hint="eastAsia"/>
+        </w:rPr>
+        <w:t>除了</w:t>
+      </w:r>
+      <w:r>
+        <w:t>XEngine_AVToolApp.exe</w:t>
+      </w:r>
+      <w:r>
+        <w:rPr>
+          <w:rFonts w:hint="eastAsia"/>
+        </w:rPr>
+        <w:t xml:space="preserve"> </w:t>
+      </w:r>
+      <w:r>
+        <w:rPr>
+          <w:rFonts w:hint="eastAsia"/>
+        </w:rPr>
+        <w:t>可以运行用来进行音视频转码外</w:t>
+      </w:r>
+      <w:r>
+        <w:rPr>
+          <w:rFonts w:hint="eastAsia"/>
+        </w:rPr>
+        <w:t>,</w:t>
+      </w:r>
+      <w:r>
+        <w:t xml:space="preserve"> XEngine_AVCodecApp.exe</w:t>
+      </w:r>
+      <w:r>
+        <w:rPr>
+          <w:rFonts w:hint="eastAsia"/>
+        </w:rPr>
+        <w:t>也可以单独运行用来作为转码服务</w:t>
+      </w:r>
+      <w:r>
+        <w:rPr>
+          <w:rFonts w:hint="eastAsia"/>
+        </w:rPr>
+        <w:t>.</w:t>
+      </w:r>
+      <w:r>
+        <w:t xml:space="preserve"> AVToolApp</w:t>
+      </w:r>
+      <w:r>
+        <w:rPr>
+          <w:rFonts w:hint="eastAsia"/>
+        </w:rPr>
+        <w:t xml:space="preserve"> </w:t>
+      </w:r>
+      <w:r>
+        <w:rPr>
+          <w:rFonts w:hint="eastAsia"/>
+        </w:rPr>
+        <w:t>调用了</w:t>
+      </w:r>
+      <w:r>
+        <w:t>AVCodecApp</w:t>
+      </w:r>
+      <w:r>
+        <w:rPr>
+          <w:rFonts w:hint="eastAsia"/>
+        </w:rPr>
+        <w:t xml:space="preserve"> </w:t>
+      </w:r>
+      <w:r>
+        <w:rPr>
+          <w:rFonts w:hint="eastAsia"/>
+        </w:rPr>
+        <w:t>来实现音视频转码</w:t>
+      </w:r>
+      <w:r>
+        <w:rPr>
+          <w:rFonts w:hint="eastAsia"/>
+        </w:rPr>
+        <w:t>.</w:t>
+      </w:r>
+    </w:p>
+    <w:p>
+      <w:pPr>
+        <w:ind w:firstLine="435"/>
+      </w:pPr>
+      <w:r>
+        <w:rPr>
+          <w:rFonts w:hint="eastAsia"/>
+        </w:rPr>
+        <w:t>此服务运行需要</w:t>
+      </w:r>
+      <w:r>
+        <w:rPr>
+          <w:rFonts w:hint="eastAsia"/>
+        </w:rPr>
+        <w:t>restful api</w:t>
+      </w:r>
+      <w:r>
+        <w:rPr>
+          <w:rFonts w:hint="eastAsia"/>
+        </w:rPr>
+        <w:t>接口实现</w:t>
+      </w:r>
+      <w:r>
+        <w:rPr>
+          <w:rFonts w:hint="eastAsia"/>
+        </w:rPr>
+        <w:t>,</w:t>
+      </w:r>
+      <w:r>
+        <w:rPr>
+          <w:rFonts w:hint="eastAsia"/>
+        </w:rPr>
+        <w:t>你可以参考接口文档</w:t>
+      </w:r>
     </w:p>
     <w:p>
       <w:pPr>
         <w:pStyle w:val="1"/>
-      </w:pPr>
-      <w:bookmarkStart w:id="8" w:name="_Toc12785"/>
+        <w:ind w:firstLine="281"/>
+      </w:pPr>
+      <w:bookmarkStart w:id="9" w:name="_Toc229756643"/>
       <w:r>
         <w:rPr>
           <w:rFonts w:hint="eastAsia"/>
         </w:rPr>
         <w:t>FAQ</w:t>
       </w:r>
-      <w:bookmarkEnd w:id="8"/>
+      <w:bookmarkEnd w:id="9"/>
     </w:p>
     <w:p>
       <w:pPr>
@@ -3129,6 +4639,7 @@
           <w:ilvl w:val="0"/>
           <w:numId w:val="3"/>
         </w:numPr>
+        <w:ind w:firstLine="220"/>
       </w:pPr>
       <w:r>
         <w:rPr>
@@ -3140,16 +4651,8 @@
         <w:rPr>
           <w:rFonts w:hint="eastAsia"/>
         </w:rPr>
-        <w:t xml:space="preserve">x64 </w:t>
-      </w:r>
-      <w:proofErr w:type="spellStart"/>
-      <w:r>
-        <w:rPr>
-          <w:rFonts w:hint="eastAsia"/>
-        </w:rPr>
-        <w:t>unicode</w:t>
-      </w:r>
-      <w:proofErr w:type="spellEnd"/>
+        <w:t>x64 unicode</w:t>
+      </w:r>
       <w:r>
         <w:rPr>
           <w:rFonts w:hint="eastAsia"/>
@@ -3163,18 +4666,31 @@
           <w:ilvl w:val="0"/>
           <w:numId w:val="3"/>
         </w:numPr>
-      </w:pPr>
-      <w:r>
-        <w:rPr>
-          <w:rFonts w:hint="eastAsia"/>
-        </w:rPr>
-        <w:t>NVIDIA</w:t>
-      </w:r>
-      <w:r>
-        <w:rPr>
-          <w:rFonts w:hint="eastAsia"/>
-        </w:rPr>
-        <w:t>的显卡不生效可能是驱动程序过低</w:t>
+        <w:ind w:firstLine="220"/>
+      </w:pPr>
+      <w:r>
+        <w:rPr>
+          <w:rFonts w:hint="eastAsia"/>
+        </w:rPr>
+        <w:t>显卡</w:t>
+      </w:r>
+      <w:r>
+        <w:rPr>
+          <w:rFonts w:hint="eastAsia"/>
+        </w:rPr>
+        <w:t>加速</w:t>
+      </w:r>
+      <w:r>
+        <w:rPr>
+          <w:rFonts w:hint="eastAsia"/>
+        </w:rPr>
+        <w:t>有时候</w:t>
+      </w:r>
+      <w:r>
+        <w:rPr>
+          <w:rFonts w:hint="eastAsia"/>
+        </w:rPr>
+        <w:t>不生效可能是驱动程序过低</w:t>
       </w:r>
       <w:r>
         <w:rPr>
@@ -3195,6 +4711,7 @@
           <w:ilvl w:val="0"/>
           <w:numId w:val="3"/>
         </w:numPr>
+        <w:ind w:firstLine="220"/>
       </w:pPr>
       <w:r>
         <w:rPr>
@@ -3228,12 +4745,8 @@
       </w:r>
     </w:p>
     <w:sectPr>
-      <w:headerReference w:type="even" r:id="rId11"/>
-      <w:headerReference w:type="default" r:id="rId12"/>
-      <w:footerReference w:type="even" r:id="rId13"/>
-      <w:footerReference w:type="default" r:id="rId14"/>
-      <w:headerReference w:type="first" r:id="rId15"/>
-      <w:footerReference w:type="first" r:id="rId16"/>
+      <w:headerReference w:type="default" r:id="rId16"/>
+      <w:footerReference w:type="default" r:id="rId17"/>
       <w:pgSz w:w="11906" w:h="16838"/>
       <w:pgMar w:top="1440" w:right="1800" w:bottom="1440" w:left="1800" w:header="851" w:footer="992" w:gutter="0"/>
       <w:cols w:space="425"/>
@@ -3269,16 +4782,6 @@
 </file>
 
 <file path=word/footer1.xml><?xml version="1.0" encoding="utf-8"?>
-<w:ftr xmlns:wpc="http://schemas.microsoft.com/office/word/2010/wordprocessingCanvas" xmlns:cx="http://schemas.microsoft.com/office/drawing/2014/chartex" xmlns:cx1="http://schemas.microsoft.com/office/drawing/2015/9/8/chartex" xmlns:cx2="http://schemas.microsoft.com/office/drawing/2015/10/21/chartex" xmlns:cx3="http://schemas.microsoft.com/office/drawing/2016/5/9/chartex" xmlns:cx4="http://schemas.microsoft.com/office/drawing/2016/5/10/chartex" xmlns:cx5="http://schemas.microsoft.com/office/drawing/2016/5/11/chartex" xmlns:cx6="http://schemas.microsoft.com/office/drawing/2016/5/12/chartex" xmlns:cx7="http://schemas.microsoft.com/office/drawing/2016/5/13/chartex" xmlns:cx8="http://schemas.microsoft.com/office/drawing/2016/5/14/chartex" xmlns:mc="http://schemas.openxmlformats.org/markup-compatibility/2006" xmlns:aink="http://schemas.microsoft.com/office/drawing/2016/ink" xmlns:am3d="http://schemas.microsoft.com/office/drawing/2017/model3d" xmlns:o="urn:schemas-microsoft-com:office:office" xmlns:oel="http://schemas.microsoft.com/office/2019/extlst" xmlns:r="http://schemas.openxmlformats.org/officeDocument/2006/relationships" xmlns:m="http://schemas.openxmlformats.org/officeDocument/2006/math" xmlns:v="urn:schemas-microsoft-com:vml" xmlns:wp14="http://schemas.microsoft.com/office/word/2010/wordprocessingDrawing" xmlns:wp="http://schemas.openxmlformats.org/drawingml/2006/wordprocessingDrawing" xmlns:w10="urn:schemas-microsoft-com:office:word" xmlns:w="http://schemas.openxmlformats.org/wordprocessingml/2006/main" xmlns:w14="http://schemas.microsoft.com/office/word/2010/wordml" xmlns:w15="http://schemas.microsoft.com/office/word/2012/wordml" xmlns:w16cex="http://schemas.microsoft.com/office/word/2018/wordml/cex" xmlns:w16cid="http://schemas.microsoft.com/office/word/2016/wordml/cid" xmlns:w16="http://schemas.microsoft.com/office/word/2018/wordml" xmlns:w16du="http://schemas.microsoft.com/office/word/2023/wordml/word16du" xmlns:w16sdtdh="http://schemas.microsoft.com/office/word/2020/wordml/sdtdatahash" xmlns:w16sdtfl="http://schemas.microsoft.com/office/word/2024/wordml/sdtformatlock" xmlns:w16se="http://schemas.microsoft.com/office/word/2015/wordml/symex" xmlns:wpg="http://schemas.microsoft.com/office/word/2010/wordprocessingGroup" xmlns:wpi="http://schemas.microsoft.com/office/word/2010/wordprocessingInk" xmlns:wne="http://schemas.microsoft.com/office/word/2006/wordml" xmlns:wps="http://schemas.microsoft.com/office/word/2010/wordprocessingShape" mc:Ignorable="w14 w15 w16se w16cid w16 w16cex w16sdtdh w16sdtfl w16du wp14">
-  <w:p>
-    <w:pPr>
-      <w:pStyle w:val="a7"/>
-    </w:pPr>
-  </w:p>
-</w:ftr>
-</file>
-
-<file path=word/footer2.xml><?xml version="1.0" encoding="utf-8"?>
 <w:ftr xmlns:wpc="http://schemas.microsoft.com/office/word/2010/wordprocessingCanvas" xmlns:cx="http://schemas.microsoft.com/office/drawing/2014/chartex" xmlns:cx1="http://schemas.microsoft.com/office/drawing/2015/9/8/chartex" xmlns:cx2="http://schemas.microsoft.com/office/drawing/2015/10/21/chartex" xmlns:cx3="http://schemas.microsoft.com/office/drawing/2016/5/9/chartex" xmlns:cx4="http://schemas.microsoft.com/office/drawing/2016/5/10/chartex" xmlns:cx5="http://schemas.microsoft.com/office/drawing/2016/5/11/chartex" xmlns:cx6="http://schemas.microsoft.com/office/drawing/2016/5/12/chartex" xmlns:cx7="http://schemas.microsoft.com/office/drawing/2016/5/13/chartex" xmlns:cx8="http://schemas.microsoft.com/office/drawing/2016/5/14/chartex" xmlns:mc="http://schemas.openxmlformats.org/markup-compatibility/2006" xmlns:aink="http://schemas.microsoft.com/office/drawing/2016/ink" xmlns:am3d="http://schemas.microsoft.com/office/drawing/2017/model3d" xmlns:o="urn:schemas-microsoft-com:office:office" xmlns:oel="http://schemas.microsoft.com/office/2019/extlst" xmlns:r="http://schemas.openxmlformats.org/officeDocument/2006/relationships" xmlns:m="http://schemas.openxmlformats.org/officeDocument/2006/math" xmlns:v="urn:schemas-microsoft-com:vml" xmlns:wp14="http://schemas.microsoft.com/office/word/2010/wordprocessingDrawing" xmlns:wp="http://schemas.openxmlformats.org/drawingml/2006/wordprocessingDrawing" xmlns:w10="urn:schemas-microsoft-com:office:word" xmlns:w="http://schemas.openxmlformats.org/wordprocessingml/2006/main" xmlns:w14="http://schemas.microsoft.com/office/word/2010/wordml" xmlns:w15="http://schemas.microsoft.com/office/word/2012/wordml" xmlns:w16cex="http://schemas.microsoft.com/office/word/2018/wordml/cex" xmlns:w16cid="http://schemas.microsoft.com/office/word/2016/wordml/cid" xmlns:w16="http://schemas.microsoft.com/office/word/2018/wordml" xmlns:w16du="http://schemas.microsoft.com/office/word/2023/wordml/word16du" xmlns:w16sdtdh="http://schemas.microsoft.com/office/word/2020/wordml/sdtdatahash" xmlns:w16sdtfl="http://schemas.microsoft.com/office/word/2024/wordml/sdtformatlock" xmlns:w16se="http://schemas.microsoft.com/office/word/2015/wordml/symex" xmlns:wpg="http://schemas.microsoft.com/office/word/2010/wordprocessingGroup" xmlns:wpi="http://schemas.microsoft.com/office/word/2010/wordprocessingInk" xmlns:wne="http://schemas.microsoft.com/office/word/2006/wordml" xmlns:wps="http://schemas.microsoft.com/office/word/2010/wordprocessingShape" mc:Ignorable="w14 w15 w16se w16cid w16 w16cex w16sdtdh w16sdtfl w16du wp14">
   <w:sdt>
     <w:sdtPr>
@@ -3293,18 +4796,13 @@
           <w:p>
             <w:pPr>
               <w:pStyle w:val="a7"/>
+              <w:ind w:firstLine="180"/>
             </w:pPr>
             <w:r>
               <w:rPr>
                 <w:rFonts w:hint="eastAsia"/>
               </w:rPr>
-              <w:t>www.xyry.org</w:t>
-            </w:r>
-            <w:r>
-              <w:rPr>
-                <w:rFonts w:hint="eastAsia"/>
-              </w:rPr>
-              <w:t xml:space="preserve">                       </w:t>
+              <w:t xml:space="preserve">www.xyry.org                       </w:t>
             </w:r>
             <w:r>
               <w:rPr>
@@ -3424,16 +4922,6 @@
       </w:sdt>
     </w:sdtContent>
   </w:sdt>
-</w:ftr>
-</file>
-
-<file path=word/footer3.xml><?xml version="1.0" encoding="utf-8"?>
-<w:ftr xmlns:wpc="http://schemas.microsoft.com/office/word/2010/wordprocessingCanvas" xmlns:cx="http://schemas.microsoft.com/office/drawing/2014/chartex" xmlns:cx1="http://schemas.microsoft.com/office/drawing/2015/9/8/chartex" xmlns:cx2="http://schemas.microsoft.com/office/drawing/2015/10/21/chartex" xmlns:cx3="http://schemas.microsoft.com/office/drawing/2016/5/9/chartex" xmlns:cx4="http://schemas.microsoft.com/office/drawing/2016/5/10/chartex" xmlns:cx5="http://schemas.microsoft.com/office/drawing/2016/5/11/chartex" xmlns:cx6="http://schemas.microsoft.com/office/drawing/2016/5/12/chartex" xmlns:cx7="http://schemas.microsoft.com/office/drawing/2016/5/13/chartex" xmlns:cx8="http://schemas.microsoft.com/office/drawing/2016/5/14/chartex" xmlns:mc="http://schemas.openxmlformats.org/markup-compatibility/2006" xmlns:aink="http://schemas.microsoft.com/office/drawing/2016/ink" xmlns:am3d="http://schemas.microsoft.com/office/drawing/2017/model3d" xmlns:o="urn:schemas-microsoft-com:office:office" xmlns:oel="http://schemas.microsoft.com/office/2019/extlst" xmlns:r="http://schemas.openxmlformats.org/officeDocument/2006/relationships" xmlns:m="http://schemas.openxmlformats.org/officeDocument/2006/math" xmlns:v="urn:schemas-microsoft-com:vml" xmlns:wp14="http://schemas.microsoft.com/office/word/2010/wordprocessingDrawing" xmlns:wp="http://schemas.openxmlformats.org/drawingml/2006/wordprocessingDrawing" xmlns:w10="urn:schemas-microsoft-com:office:word" xmlns:w="http://schemas.openxmlformats.org/wordprocessingml/2006/main" xmlns:w14="http://schemas.microsoft.com/office/word/2010/wordml" xmlns:w15="http://schemas.microsoft.com/office/word/2012/wordml" xmlns:w16cex="http://schemas.microsoft.com/office/word/2018/wordml/cex" xmlns:w16cid="http://schemas.microsoft.com/office/word/2016/wordml/cid" xmlns:w16="http://schemas.microsoft.com/office/word/2018/wordml" xmlns:w16du="http://schemas.microsoft.com/office/word/2023/wordml/word16du" xmlns:w16sdtdh="http://schemas.microsoft.com/office/word/2020/wordml/sdtdatahash" xmlns:w16sdtfl="http://schemas.microsoft.com/office/word/2024/wordml/sdtformatlock" xmlns:w16se="http://schemas.microsoft.com/office/word/2015/wordml/symex" xmlns:wpg="http://schemas.microsoft.com/office/word/2010/wordprocessingGroup" xmlns:wpi="http://schemas.microsoft.com/office/word/2010/wordprocessingInk" xmlns:wne="http://schemas.microsoft.com/office/word/2006/wordml" xmlns:wps="http://schemas.microsoft.com/office/word/2010/wordprocessingShape" mc:Ignorable="w14 w15 w16se w16cid w16 w16cex w16sdtdh w16sdtfl w16du wp14">
-  <w:p>
-    <w:pPr>
-      <w:pStyle w:val="a7"/>
-    </w:pPr>
-  </w:p>
 </w:ftr>
 </file>
 
@@ -3467,31 +4955,14 @@
   <w:p>
     <w:pPr>
       <w:pStyle w:val="a9"/>
-    </w:pPr>
-  </w:p>
-</w:hdr>
-</file>
-
-<file path=word/header2.xml><?xml version="1.0" encoding="utf-8"?>
-<w:hdr xmlns:wpc="http://schemas.microsoft.com/office/word/2010/wordprocessingCanvas" xmlns:cx="http://schemas.microsoft.com/office/drawing/2014/chartex" xmlns:cx1="http://schemas.microsoft.com/office/drawing/2015/9/8/chartex" xmlns:cx2="http://schemas.microsoft.com/office/drawing/2015/10/21/chartex" xmlns:cx3="http://schemas.microsoft.com/office/drawing/2016/5/9/chartex" xmlns:cx4="http://schemas.microsoft.com/office/drawing/2016/5/10/chartex" xmlns:cx5="http://schemas.microsoft.com/office/drawing/2016/5/11/chartex" xmlns:cx6="http://schemas.microsoft.com/office/drawing/2016/5/12/chartex" xmlns:cx7="http://schemas.microsoft.com/office/drawing/2016/5/13/chartex" xmlns:cx8="http://schemas.microsoft.com/office/drawing/2016/5/14/chartex" xmlns:mc="http://schemas.openxmlformats.org/markup-compatibility/2006" xmlns:aink="http://schemas.microsoft.com/office/drawing/2016/ink" xmlns:am3d="http://schemas.microsoft.com/office/drawing/2017/model3d" xmlns:o="urn:schemas-microsoft-com:office:office" xmlns:oel="http://schemas.microsoft.com/office/2019/extlst" xmlns:r="http://schemas.openxmlformats.org/officeDocument/2006/relationships" xmlns:m="http://schemas.openxmlformats.org/officeDocument/2006/math" xmlns:v="urn:schemas-microsoft-com:vml" xmlns:wp14="http://schemas.microsoft.com/office/word/2010/wordprocessingDrawing" xmlns:wp="http://schemas.openxmlformats.org/drawingml/2006/wordprocessingDrawing" xmlns:w10="urn:schemas-microsoft-com:office:word" xmlns:w="http://schemas.openxmlformats.org/wordprocessingml/2006/main" xmlns:w14="http://schemas.microsoft.com/office/word/2010/wordml" xmlns:w15="http://schemas.microsoft.com/office/word/2012/wordml" xmlns:w16cex="http://schemas.microsoft.com/office/word/2018/wordml/cex" xmlns:w16cid="http://schemas.microsoft.com/office/word/2016/wordml/cid" xmlns:w16="http://schemas.microsoft.com/office/word/2018/wordml" xmlns:w16du="http://schemas.microsoft.com/office/word/2023/wordml/word16du" xmlns:w16sdtdh="http://schemas.microsoft.com/office/word/2020/wordml/sdtdatahash" xmlns:w16sdtfl="http://schemas.microsoft.com/office/word/2024/wordml/sdtformatlock" xmlns:w16se="http://schemas.microsoft.com/office/word/2015/wordml/symex" xmlns:wpg="http://schemas.microsoft.com/office/word/2010/wordprocessingGroup" xmlns:wpi="http://schemas.microsoft.com/office/word/2010/wordprocessingInk" xmlns:wne="http://schemas.microsoft.com/office/word/2006/wordml" xmlns:wps="http://schemas.microsoft.com/office/word/2010/wordprocessingShape" mc:Ignorable="w14 w15 w16se w16cid w16 w16cex w16sdtdh w16sdtfl w16du wp14">
-  <w:p>
-    <w:pPr>
-      <w:pStyle w:val="a9"/>
+      <w:ind w:firstLine="180"/>
       <w:jc w:val="both"/>
     </w:pPr>
-    <w:proofErr w:type="spellStart"/>
     <w:r>
       <w:rPr>
         <w:rFonts w:hint="eastAsia"/>
       </w:rPr>
-      <w:t>AVCodecTool</w:t>
-    </w:r>
-    <w:proofErr w:type="spellEnd"/>
-    <w:r>
-      <w:rPr>
-        <w:rFonts w:hint="eastAsia"/>
-      </w:rPr>
-      <w:t xml:space="preserve">                                  </w:t>
+      <w:t xml:space="preserve">AVCodecTool                                  </w:t>
     </w:r>
     <w:r>
       <w:rPr>
@@ -3515,16 +4986,6 @@
 </w:hdr>
 </file>
 
-<file path=word/header3.xml><?xml version="1.0" encoding="utf-8"?>
-<w:hdr xmlns:wpc="http://schemas.microsoft.com/office/word/2010/wordprocessingCanvas" xmlns:cx="http://schemas.microsoft.com/office/drawing/2014/chartex" xmlns:cx1="http://schemas.microsoft.com/office/drawing/2015/9/8/chartex" xmlns:cx2="http://schemas.microsoft.com/office/drawing/2015/10/21/chartex" xmlns:cx3="http://schemas.microsoft.com/office/drawing/2016/5/9/chartex" xmlns:cx4="http://schemas.microsoft.com/office/drawing/2016/5/10/chartex" xmlns:cx5="http://schemas.microsoft.com/office/drawing/2016/5/11/chartex" xmlns:cx6="http://schemas.microsoft.com/office/drawing/2016/5/12/chartex" xmlns:cx7="http://schemas.microsoft.com/office/drawing/2016/5/13/chartex" xmlns:cx8="http://schemas.microsoft.com/office/drawing/2016/5/14/chartex" xmlns:mc="http://schemas.openxmlformats.org/markup-compatibility/2006" xmlns:aink="http://schemas.microsoft.com/office/drawing/2016/ink" xmlns:am3d="http://schemas.microsoft.com/office/drawing/2017/model3d" xmlns:o="urn:schemas-microsoft-com:office:office" xmlns:oel="http://schemas.microsoft.com/office/2019/extlst" xmlns:r="http://schemas.openxmlformats.org/officeDocument/2006/relationships" xmlns:m="http://schemas.openxmlformats.org/officeDocument/2006/math" xmlns:v="urn:schemas-microsoft-com:vml" xmlns:wp14="http://schemas.microsoft.com/office/word/2010/wordprocessingDrawing" xmlns:wp="http://schemas.openxmlformats.org/drawingml/2006/wordprocessingDrawing" xmlns:w10="urn:schemas-microsoft-com:office:word" xmlns:w="http://schemas.openxmlformats.org/wordprocessingml/2006/main" xmlns:w14="http://schemas.microsoft.com/office/word/2010/wordml" xmlns:w15="http://schemas.microsoft.com/office/word/2012/wordml" xmlns:w16cex="http://schemas.microsoft.com/office/word/2018/wordml/cex" xmlns:w16cid="http://schemas.microsoft.com/office/word/2016/wordml/cid" xmlns:w16="http://schemas.microsoft.com/office/word/2018/wordml" xmlns:w16du="http://schemas.microsoft.com/office/word/2023/wordml/word16du" xmlns:w16sdtdh="http://schemas.microsoft.com/office/word/2020/wordml/sdtdatahash" xmlns:w16sdtfl="http://schemas.microsoft.com/office/word/2024/wordml/sdtformatlock" xmlns:w16se="http://schemas.microsoft.com/office/word/2015/wordml/symex" xmlns:wpg="http://schemas.microsoft.com/office/word/2010/wordprocessingGroup" xmlns:wpi="http://schemas.microsoft.com/office/word/2010/wordprocessingInk" xmlns:wne="http://schemas.microsoft.com/office/word/2006/wordml" xmlns:wps="http://schemas.microsoft.com/office/word/2010/wordprocessingShape" mc:Ignorable="w14 w15 w16se w16cid w16 w16cex w16sdtdh w16sdtfl w16du wp14">
-  <w:p>
-    <w:pPr>
-      <w:pStyle w:val="a9"/>
-    </w:pPr>
-  </w:p>
-</w:hdr>
-</file>
-
 <file path=word/numbering.xml><?xml version="1.0" encoding="utf-8"?>
 <w:numbering xmlns:wpc="http://schemas.microsoft.com/office/word/2010/wordprocessingCanvas" xmlns:cx="http://schemas.microsoft.com/office/drawing/2014/chartex" xmlns:cx1="http://schemas.microsoft.com/office/drawing/2015/9/8/chartex" xmlns:cx2="http://schemas.microsoft.com/office/drawing/2015/10/21/chartex" xmlns:cx3="http://schemas.microsoft.com/office/drawing/2016/5/9/chartex" xmlns:cx4="http://schemas.microsoft.com/office/drawing/2016/5/10/chartex" xmlns:cx5="http://schemas.microsoft.com/office/drawing/2016/5/11/chartex" xmlns:cx6="http://schemas.microsoft.com/office/drawing/2016/5/12/chartex" xmlns:cx7="http://schemas.microsoft.com/office/drawing/2016/5/13/chartex" xmlns:cx8="http://schemas.microsoft.com/office/drawing/2016/5/14/chartex" xmlns:mc="http://schemas.openxmlformats.org/markup-compatibility/2006" xmlns:aink="http://schemas.microsoft.com/office/drawing/2016/ink" xmlns:am3d="http://schemas.microsoft.com/office/drawing/2017/model3d" xmlns:o="urn:schemas-microsoft-com:office:office" xmlns:oel="http://schemas.microsoft.com/office/2019/extlst" xmlns:r="http://schemas.openxmlformats.org/officeDocument/2006/relationships" xmlns:m="http://schemas.openxmlformats.org/officeDocument/2006/math" xmlns:v="urn:schemas-microsoft-com:vml" xmlns:wp14="http://schemas.microsoft.com/office/word/2010/wordprocessingDrawing" xmlns:wp="http://schemas.openxmlformats.org/drawingml/2006/wordprocessingDrawing" xmlns:w10="urn:schemas-microsoft-com:office:word" xmlns:w="http://schemas.openxmlformats.org/wordprocessingml/2006/main" xmlns:w14="http://schemas.microsoft.com/office/word/2010/wordml" xmlns:w15="http://schemas.microsoft.com/office/word/2012/wordml" xmlns:w16cex="http://schemas.microsoft.com/office/word/2018/wordml/cex" xmlns:w16cid="http://schemas.microsoft.com/office/word/2016/wordml/cid" xmlns:w16="http://schemas.microsoft.com/office/word/2018/wordml" xmlns:w16du="http://schemas.microsoft.com/office/word/2023/wordml/word16du" xmlns:w16sdtdh="http://schemas.microsoft.com/office/word/2020/wordml/sdtdatahash" xmlns:w16sdtfl="http://schemas.microsoft.com/office/word/2024/wordml/sdtformatlock" xmlns:w16se="http://schemas.microsoft.com/office/word/2015/wordml/symex" xmlns:wpg="http://schemas.microsoft.com/office/word/2010/wordprocessingGroup" xmlns:wpi="http://schemas.microsoft.com/office/word/2010/wordprocessingInk" xmlns:wne="http://schemas.microsoft.com/office/word/2006/wordml" xmlns:wps="http://schemas.microsoft.com/office/word/2010/wordprocessingShape" mc:Ignorable="w14 w15 w16se w16cid w16 w16cex w16sdtdh w16sdtfl w16du wp14">
   <w:abstractNum w:abstractNumId="0" w15:restartNumberingAfterBreak="0">
@@ -3568,7 +5029,6 @@
     <w:lvl w:ilvl="0" w:tplc="82ACA4A8">
       <w:start w:val="1"/>
       <w:numFmt w:val="bullet"/>
-      <w:pStyle w:val="a"/>
       <w:lvlText w:val=""/>
       <w:lvlJc w:val="left"/>
       <w:pPr>
@@ -3676,6 +5136,120 @@
     </w:lvl>
   </w:abstractNum>
   <w:abstractNum w:abstractNumId="3" w15:restartNumberingAfterBreak="0">
+    <w:nsid w:val="63A46483"/>
+    <w:multiLevelType w:val="hybridMultilevel"/>
+    <w:tmpl w:val="2194815C"/>
+    <w:lvl w:ilvl="0" w:tplc="2222C5C8">
+      <w:start w:val="1"/>
+      <w:numFmt w:val="bullet"/>
+      <w:pStyle w:val="a"/>
+      <w:lvlText w:val=""/>
+      <w:lvlJc w:val="left"/>
+      <w:pPr>
+        <w:ind w:left="440" w:hanging="440"/>
+      </w:pPr>
+      <w:rPr>
+        <w:rFonts w:ascii="Wingdings" w:hAnsi="Wingdings" w:hint="default"/>
+      </w:rPr>
+    </w:lvl>
+    <w:lvl w:ilvl="1" w:tplc="04090003" w:tentative="1">
+      <w:start w:val="1"/>
+      <w:numFmt w:val="bullet"/>
+      <w:lvlText w:val=""/>
+      <w:lvlJc w:val="left"/>
+      <w:pPr>
+        <w:ind w:left="880" w:hanging="440"/>
+      </w:pPr>
+      <w:rPr>
+        <w:rFonts w:ascii="Wingdings" w:hAnsi="Wingdings" w:hint="default"/>
+      </w:rPr>
+    </w:lvl>
+    <w:lvl w:ilvl="2" w:tplc="04090005" w:tentative="1">
+      <w:start w:val="1"/>
+      <w:numFmt w:val="bullet"/>
+      <w:lvlText w:val=""/>
+      <w:lvlJc w:val="left"/>
+      <w:pPr>
+        <w:ind w:left="1320" w:hanging="440"/>
+      </w:pPr>
+      <w:rPr>
+        <w:rFonts w:ascii="Wingdings" w:hAnsi="Wingdings" w:hint="default"/>
+      </w:rPr>
+    </w:lvl>
+    <w:lvl w:ilvl="3" w:tplc="04090001" w:tentative="1">
+      <w:start w:val="1"/>
+      <w:numFmt w:val="bullet"/>
+      <w:lvlText w:val=""/>
+      <w:lvlJc w:val="left"/>
+      <w:pPr>
+        <w:ind w:left="1760" w:hanging="440"/>
+      </w:pPr>
+      <w:rPr>
+        <w:rFonts w:ascii="Wingdings" w:hAnsi="Wingdings" w:hint="default"/>
+      </w:rPr>
+    </w:lvl>
+    <w:lvl w:ilvl="4" w:tplc="04090003" w:tentative="1">
+      <w:start w:val="1"/>
+      <w:numFmt w:val="bullet"/>
+      <w:lvlText w:val=""/>
+      <w:lvlJc w:val="left"/>
+      <w:pPr>
+        <w:ind w:left="2200" w:hanging="440"/>
+      </w:pPr>
+      <w:rPr>
+        <w:rFonts w:ascii="Wingdings" w:hAnsi="Wingdings" w:hint="default"/>
+      </w:rPr>
+    </w:lvl>
+    <w:lvl w:ilvl="5" w:tplc="04090005" w:tentative="1">
+      <w:start w:val="1"/>
+      <w:numFmt w:val="bullet"/>
+      <w:lvlText w:val=""/>
+      <w:lvlJc w:val="left"/>
+      <w:pPr>
+        <w:ind w:left="2640" w:hanging="440"/>
+      </w:pPr>
+      <w:rPr>
+        <w:rFonts w:ascii="Wingdings" w:hAnsi="Wingdings" w:hint="default"/>
+      </w:rPr>
+    </w:lvl>
+    <w:lvl w:ilvl="6" w:tplc="04090001" w:tentative="1">
+      <w:start w:val="1"/>
+      <w:numFmt w:val="bullet"/>
+      <w:lvlText w:val=""/>
+      <w:lvlJc w:val="left"/>
+      <w:pPr>
+        <w:ind w:left="3080" w:hanging="440"/>
+      </w:pPr>
+      <w:rPr>
+        <w:rFonts w:ascii="Wingdings" w:hAnsi="Wingdings" w:hint="default"/>
+      </w:rPr>
+    </w:lvl>
+    <w:lvl w:ilvl="7" w:tplc="04090003" w:tentative="1">
+      <w:start w:val="1"/>
+      <w:numFmt w:val="bullet"/>
+      <w:lvlText w:val=""/>
+      <w:lvlJc w:val="left"/>
+      <w:pPr>
+        <w:ind w:left="3520" w:hanging="440"/>
+      </w:pPr>
+      <w:rPr>
+        <w:rFonts w:ascii="Wingdings" w:hAnsi="Wingdings" w:hint="default"/>
+      </w:rPr>
+    </w:lvl>
+    <w:lvl w:ilvl="8" w:tplc="04090005" w:tentative="1">
+      <w:start w:val="1"/>
+      <w:numFmt w:val="bullet"/>
+      <w:lvlText w:val=""/>
+      <w:lvlJc w:val="left"/>
+      <w:pPr>
+        <w:ind w:left="3960" w:hanging="440"/>
+      </w:pPr>
+      <w:rPr>
+        <w:rFonts w:ascii="Wingdings" w:hAnsi="Wingdings" w:hint="default"/>
+      </w:rPr>
+    </w:lvl>
+  </w:abstractNum>
+  <w:abstractNum w:abstractNumId="4" w15:restartNumberingAfterBreak="0">
     <w:nsid w:val="771E8C30"/>
     <w:multiLevelType w:val="multilevel"/>
     <w:tmpl w:val="771E8C30"/>
@@ -3798,7 +5372,7 @@
     </w:lvl>
   </w:abstractNum>
   <w:num w:numId="1" w16cid:durableId="1088161050">
-    <w:abstractNumId w:val="3"/>
+    <w:abstractNumId w:val="4"/>
   </w:num>
   <w:num w:numId="2" w16cid:durableId="1440905150">
     <w:abstractNumId w:val="1"/>
@@ -3808,6 +5382,9 @@
   </w:num>
   <w:num w:numId="4" w16cid:durableId="1544827091">
     <w:abstractNumId w:val="2"/>
+  </w:num>
+  <w:num w:numId="5" w16cid:durableId="1287354254">
+    <w:abstractNumId w:val="3"/>
   </w:num>
 </w:numbering>
 </file>
@@ -4893,10 +6470,10 @@
     <w:autoRedefine/>
     <w:uiPriority w:val="34"/>
     <w:qFormat/>
-    <w:rsid w:val="00741A02"/>
+    <w:rsid w:val="003B5503"/>
     <w:pPr>
       <w:numPr>
-        <w:numId w:val="4"/>
+        <w:numId w:val="5"/>
       </w:numPr>
       <w:contextualSpacing/>
     </w:pPr>

</xml_diff>